<commit_message>
Dodane i zrcalne grupe za Okić
</commit_message>
<xml_diff>
--- a/Okic/Kontrolne_kartice_za_tecajce_Okic.docx
+++ b/Okic/Kontrolne_kartice_za_tecajce_Okic.docx
@@ -4207,6 +4207,4262 @@
                 <w:sz w:val="18"/>
               </w:rPr>
               <w:t>500 m</w:t>
+            </w:r>
+          </w:p>
+        </w:tc>
+        <w:tc>
+          <w:tcPr>
+            <w:tcW w:type="dxa" w:w="1587"/>
+          </w:tcPr>
+          <w:p>
+            <w:pPr>
+              <w:spacing w:before="20" w:after="20"/>
+              <w:jc w:val="left"/>
+            </w:pPr>
+            <w:r/>
+            <w:r>
+              <w:rPr>
+                <w:b w:val="0"/>
+                <w:sz w:val="18"/>
+              </w:rPr>
+              <w:t>DOM</w:t>
+            </w:r>
+          </w:p>
+        </w:tc>
+        <w:tc>
+          <w:tcPr>
+            <w:tcW w:type="dxa" w:w="4480"/>
+          </w:tcPr>
+          <w:p>
+            <w:pPr>
+              <w:spacing w:before="20" w:after="20"/>
+              <w:jc w:val="left"/>
+            </w:pPr>
+            <w:r/>
+            <w:r>
+              <w:rPr>
+                <w:b w:val="0"/>
+                <w:sz w:val="18"/>
+              </w:rPr>
+              <w:t>Planinarski dom</w:t>
+            </w:r>
+          </w:p>
+        </w:tc>
+      </w:tr>
+    </w:tbl>
+    <w:p>
+      <w:pPr>
+        <w:spacing w:before="0" w:after="0"/>
+      </w:pPr>
+      <w:r>
+        <w:br w:type="page"/>
+      </w:r>
+    </w:p>
+    <w:tbl>
+      <w:tblPr>
+        <w:tblW w:type="auto" w:w="0"/>
+        <w:jc w:val="center"/>
+        <w:tblLook w:firstColumn="1" w:firstRow="1" w:lastColumn="0" w:lastRow="0" w:noHBand="0" w:noVBand="1" w:val="04A0"/>
+      </w:tblPr>
+      <w:tblGrid>
+        <w:gridCol w:w="2041"/>
+        <w:gridCol w:w="2041"/>
+        <w:gridCol w:w="2041"/>
+        <w:gridCol w:w="2041"/>
+        <w:gridCol w:w="2041"/>
+      </w:tblGrid>
+      <w:tr>
+        <w:trPr>
+          <w:trHeight w:val="1814" w:hRule="exact"/>
+        </w:trPr>
+        <w:tc>
+          <w:tcPr>
+            <w:tcW w:type="dxa" w:w="2041"/>
+            <w:tcBorders>
+              <w:top w:val="single" w:sz="18" w:color="000000"/>
+              <w:left w:val="single" w:sz="18" w:color="000000"/>
+              <w:bottom w:val="single" w:sz="18" w:color="000000"/>
+              <w:right w:val="single" w:sz="18" w:color="000000"/>
+            </w:tcBorders>
+          </w:tcPr>
+          <w:p/>
+        </w:tc>
+        <w:tc>
+          <w:tcPr>
+            <w:tcW w:type="dxa" w:w="2041"/>
+            <w:tcBorders>
+              <w:top w:val="single" w:sz="18" w:color="000000"/>
+              <w:left w:val="single" w:sz="18" w:color="000000"/>
+              <w:bottom w:val="single" w:sz="18" w:color="000000"/>
+              <w:right w:val="single" w:sz="18" w:color="000000"/>
+            </w:tcBorders>
+          </w:tcPr>
+          <w:p/>
+        </w:tc>
+        <w:tc>
+          <w:tcPr>
+            <w:tcW w:type="dxa" w:w="2041"/>
+            <w:tcBorders>
+              <w:top w:val="single" w:sz="18" w:color="000000"/>
+              <w:left w:val="single" w:sz="18" w:color="000000"/>
+              <w:bottom w:val="single" w:sz="18" w:color="000000"/>
+              <w:right w:val="single" w:sz="18" w:color="000000"/>
+            </w:tcBorders>
+          </w:tcPr>
+          <w:p/>
+        </w:tc>
+        <w:tc>
+          <w:tcPr>
+            <w:tcW w:type="dxa" w:w="2041"/>
+            <w:tcBorders>
+              <w:top w:val="single" w:sz="18" w:color="000000"/>
+              <w:left w:val="single" w:sz="18" w:color="000000"/>
+              <w:bottom w:val="single" w:sz="18" w:color="000000"/>
+              <w:right w:val="single" w:sz="18" w:color="000000"/>
+            </w:tcBorders>
+          </w:tcPr>
+          <w:p/>
+        </w:tc>
+        <w:tc>
+          <w:tcPr>
+            <w:tcW w:type="dxa" w:w="2041"/>
+            <w:tcBorders>
+              <w:top w:val="single" w:sz="18" w:color="000000"/>
+              <w:left w:val="single" w:sz="18" w:color="000000"/>
+              <w:bottom w:val="single" w:sz="18" w:color="000000"/>
+              <w:right w:val="single" w:sz="18" w:color="000000"/>
+            </w:tcBorders>
+          </w:tcPr>
+          <w:p/>
+        </w:tc>
+      </w:tr>
+      <w:tr>
+        <w:trPr>
+          <w:trHeight w:val="397" w:hRule="exact"/>
+        </w:trPr>
+        <w:tc>
+          <w:tcPr>
+            <w:tcW w:type="dxa" w:w="2041"/>
+            <w:tcBorders>
+              <w:top w:val="single" w:sz="12" w:color="000000"/>
+              <w:left w:val="single" w:sz="12" w:color="000000"/>
+              <w:bottom w:val="single" w:sz="12" w:color="000000"/>
+              <w:right w:val="single" w:sz="12" w:color="000000"/>
+            </w:tcBorders>
+            <w:shd w:val="clear" w:color="auto" w:fill="DDDDDD"/>
+          </w:tcPr>
+          <w:p>
+            <w:pPr>
+              <w:spacing w:before="20" w:after="20"/>
+              <w:jc w:val="center"/>
+            </w:pPr>
+            <w:r/>
+            <w:r>
+              <w:rPr>
+                <w:b/>
+                <w:sz w:val="16"/>
+              </w:rPr>
+              <w:t>DOM</w:t>
+            </w:r>
+          </w:p>
+        </w:tc>
+        <w:tc>
+          <w:tcPr>
+            <w:tcW w:type="dxa" w:w="2041"/>
+            <w:tcBorders>
+              <w:top w:val="single" w:sz="12" w:color="000000"/>
+              <w:left w:val="single" w:sz="12" w:color="000000"/>
+              <w:bottom w:val="single" w:sz="12" w:color="000000"/>
+              <w:right w:val="single" w:sz="12" w:color="000000"/>
+            </w:tcBorders>
+            <w:shd w:val="clear" w:color="auto" w:fill="DDDDDD"/>
+          </w:tcPr>
+          <w:p>
+            <w:pPr>
+              <w:spacing w:before="20" w:after="20"/>
+              <w:jc w:val="center"/>
+            </w:pPr>
+            <w:r/>
+            <w:r>
+              <w:rPr>
+                <w:b/>
+                <w:sz w:val="16"/>
+              </w:rPr>
+              <w:t>KT SIB</w:t>
+            </w:r>
+          </w:p>
+        </w:tc>
+        <w:tc>
+          <w:tcPr>
+            <w:tcW w:type="dxa" w:w="2041"/>
+            <w:tcBorders>
+              <w:top w:val="single" w:sz="12" w:color="000000"/>
+              <w:left w:val="single" w:sz="12" w:color="000000"/>
+              <w:bottom w:val="single" w:sz="12" w:color="000000"/>
+              <w:right w:val="single" w:sz="12" w:color="000000"/>
+            </w:tcBorders>
+            <w:shd w:val="clear" w:color="auto" w:fill="DDDDDD"/>
+          </w:tcPr>
+          <w:p>
+            <w:pPr>
+              <w:spacing w:before="20" w:after="20"/>
+              <w:jc w:val="center"/>
+            </w:pPr>
+            <w:r/>
+            <w:r>
+              <w:rPr>
+                <w:b/>
+                <w:sz w:val="16"/>
+              </w:rPr>
+              <w:t>KT SA</w:t>
+            </w:r>
+          </w:p>
+        </w:tc>
+        <w:tc>
+          <w:tcPr>
+            <w:tcW w:type="dxa" w:w="2041"/>
+            <w:tcBorders>
+              <w:top w:val="single" w:sz="12" w:color="000000"/>
+              <w:left w:val="single" w:sz="12" w:color="000000"/>
+              <w:bottom w:val="single" w:sz="12" w:color="000000"/>
+              <w:right w:val="single" w:sz="12" w:color="000000"/>
+            </w:tcBorders>
+            <w:shd w:val="clear" w:color="auto" w:fill="DDDDDD"/>
+          </w:tcPr>
+          <w:p>
+            <w:pPr>
+              <w:spacing w:before="20" w:after="20"/>
+              <w:jc w:val="center"/>
+            </w:pPr>
+            <w:r/>
+            <w:r>
+              <w:rPr>
+                <w:b/>
+                <w:sz w:val="16"/>
+              </w:rPr>
+              <w:t>KT JZA</w:t>
+            </w:r>
+          </w:p>
+        </w:tc>
+        <w:tc>
+          <w:tcPr>
+            <w:tcW w:type="dxa" w:w="2041"/>
+            <w:tcBorders>
+              <w:top w:val="single" w:sz="12" w:color="000000"/>
+              <w:left w:val="single" w:sz="12" w:color="000000"/>
+              <w:bottom w:val="single" w:sz="12" w:color="000000"/>
+              <w:right w:val="single" w:sz="12" w:color="000000"/>
+            </w:tcBorders>
+            <w:shd w:val="clear" w:color="auto" w:fill="DDDDDD"/>
+          </w:tcPr>
+          <w:p>
+            <w:pPr>
+              <w:spacing w:before="20" w:after="20"/>
+              <w:jc w:val="center"/>
+            </w:pPr>
+            <w:r/>
+            <w:r>
+              <w:rPr>
+                <w:b/>
+                <w:sz w:val="16"/>
+              </w:rPr>
+              <w:t>KT JA</w:t>
+            </w:r>
+          </w:p>
+        </w:tc>
+      </w:tr>
+    </w:tbl>
+    <w:p>
+      <w:pPr>
+        <w:spacing w:before="160" w:after="0"/>
+        <w:jc w:val="center"/>
+      </w:pPr>
+      <w:r>
+        <w:rPr>
+          <w:b w:val="0"/>
+          <w:sz w:val="24"/>
+        </w:rPr>
+        <w:t>Vježba orijentacije — Okić</w:t>
+      </w:r>
+    </w:p>
+    <w:p>
+      <w:pPr>
+        <w:spacing w:before="40" w:after="120"/>
+        <w:jc w:val="center"/>
+      </w:pPr>
+      <w:r>
+        <w:rPr>
+          <w:b/>
+          <w:sz w:val="30"/>
+        </w:rPr>
+        <w:t>Grupa 5</w:t>
+      </w:r>
+    </w:p>
+    <w:p>
+      <w:pPr>
+        <w:spacing w:before="0" w:after="40"/>
+        <w:jc w:val="left"/>
+      </w:pPr>
+      <w:r>
+        <w:rPr>
+          <w:b/>
+          <w:sz w:val="18"/>
+        </w:rPr>
+        <w:t>Upute:</w:t>
+      </w:r>
+    </w:p>
+    <w:p>
+      <w:pPr>
+        <w:pStyle w:val="ListBullet"/>
+        <w:spacing w:before="0" w:after="0"/>
+      </w:pPr>
+      <w:r>
+        <w:rPr>
+          <w:sz w:val="18"/>
+        </w:rPr>
+        <w:t>Staza kreće i završava na DOM-u (planinarskom domu).</w:t>
+      </w:r>
+    </w:p>
+    <w:p>
+      <w:pPr>
+        <w:pStyle w:val="ListBullet"/>
+        <w:spacing w:before="0" w:after="0"/>
+      </w:pPr>
+      <w:r>
+        <w:rPr>
+          <w:sz w:val="18"/>
+        </w:rPr>
+        <w:t>Koristeći tablicu segmenata i kompas, ucrtaj sve kontrolne točke na karti. Voditelj vježbe mora potvrditi položaj svih točaka prije polaska na teren.</w:t>
+      </w:r>
+    </w:p>
+    <w:p>
+      <w:pPr>
+        <w:pStyle w:val="ListBullet"/>
+        <w:spacing w:before="0" w:after="0"/>
+      </w:pPr>
+      <w:r>
+        <w:rPr>
+          <w:sz w:val="18"/>
+        </w:rPr>
+        <w:t>Na svakom KT-u dokaži prolazak bušenjem kartona bušačem koji se nalazi na toj točki.</w:t>
+      </w:r>
+    </w:p>
+    <w:p>
+      <w:pPr>
+        <w:pStyle w:val="ListBullet"/>
+        <w:spacing w:before="0" w:after="0"/>
+      </w:pPr>
+      <w:r>
+        <w:rPr>
+          <w:sz w:val="18"/>
+        </w:rPr>
+        <w:t>Svaki puta kada se buši karton, druga osoba iz grupe SMS-om dojavuje voditelju vježbe trenutne GPS koordinate. Koordinate su dostupne u navigacijskoj aplikaciji na mobitelu.</w:t>
+      </w:r>
+    </w:p>
+    <w:p>
+      <w:pPr>
+        <w:pStyle w:val="ListBullet"/>
+        <w:spacing w:before="0" w:after="0"/>
+      </w:pPr>
+      <w:r>
+        <w:rPr>
+          <w:sz w:val="18"/>
+        </w:rPr>
+        <w:t>Na terenu je dopušteno koristiti elektroničku navigaciju (mobitel, GPS aplikacija).</w:t>
+      </w:r>
+    </w:p>
+    <w:p>
+      <w:pPr>
+        <w:pStyle w:val="ListBullet"/>
+        <w:spacing w:before="0" w:after="0"/>
+      </w:pPr>
+      <w:r>
+        <w:rPr>
+          <w:sz w:val="18"/>
+        </w:rPr>
+        <w:t>Kretati se smije samo po označenim planinarskim stazama, cestama i šumskim putovima.</w:t>
+      </w:r>
+    </w:p>
+    <w:p>
+      <w:pPr>
+        <w:spacing w:before="160" w:after="40"/>
+        <w:jc w:val="left"/>
+      </w:pPr>
+      <w:r>
+        <w:rPr>
+          <w:b/>
+          <w:sz w:val="18"/>
+        </w:rPr>
+        <w:t>Segmenti rute:</w:t>
+      </w:r>
+    </w:p>
+    <w:tbl>
+      <w:tblPr>
+        <w:tblStyle w:val="TableGrid"/>
+        <w:tblW w:type="auto" w:w="0"/>
+        <w:jc w:val="center"/>
+        <w:tblLook w:firstColumn="1" w:firstRow="1" w:lastColumn="0" w:lastRow="0" w:noHBand="0" w:noVBand="1" w:val="04A0"/>
+      </w:tblPr>
+      <w:tblGrid>
+        <w:gridCol w:w="1701"/>
+        <w:gridCol w:w="1701"/>
+        <w:gridCol w:w="1701"/>
+        <w:gridCol w:w="1701"/>
+        <w:gridCol w:w="1701"/>
+        <w:gridCol w:w="1701"/>
+      </w:tblGrid>
+      <w:tr>
+        <w:tc>
+          <w:tcPr>
+            <w:tcW w:type="dxa" w:w="397"/>
+            <w:shd w:val="clear" w:color="auto" w:fill="BBBBBB"/>
+          </w:tcPr>
+          <w:p>
+            <w:pPr>
+              <w:spacing w:before="20" w:after="20"/>
+              <w:jc w:val="center"/>
+            </w:pPr>
+            <w:r/>
+            <w:r>
+              <w:rPr>
+                <w:b/>
+                <w:sz w:val="18"/>
+              </w:rPr>
+              <w:t>#</w:t>
+            </w:r>
+          </w:p>
+        </w:tc>
+        <w:tc>
+          <w:tcPr>
+            <w:tcW w:type="dxa" w:w="1587"/>
+            <w:shd w:val="clear" w:color="auto" w:fill="BBBBBB"/>
+          </w:tcPr>
+          <w:p>
+            <w:pPr>
+              <w:spacing w:before="20" w:after="20"/>
+              <w:jc w:val="center"/>
+            </w:pPr>
+            <w:r/>
+            <w:r>
+              <w:rPr>
+                <w:b/>
+                <w:sz w:val="18"/>
+              </w:rPr>
+              <w:t>Od</w:t>
+            </w:r>
+          </w:p>
+        </w:tc>
+        <w:tc>
+          <w:tcPr>
+            <w:tcW w:type="dxa" w:w="907"/>
+            <w:shd w:val="clear" w:color="auto" w:fill="BBBBBB"/>
+          </w:tcPr>
+          <w:p>
+            <w:pPr>
+              <w:spacing w:before="20" w:after="20"/>
+              <w:jc w:val="center"/>
+            </w:pPr>
+            <w:r/>
+            <w:r>
+              <w:rPr>
+                <w:b/>
+                <w:sz w:val="18"/>
+              </w:rPr>
+              <w:t>Azimut</w:t>
+            </w:r>
+          </w:p>
+        </w:tc>
+        <w:tc>
+          <w:tcPr>
+            <w:tcW w:type="dxa" w:w="1247"/>
+            <w:shd w:val="clear" w:color="auto" w:fill="BBBBBB"/>
+          </w:tcPr>
+          <w:p>
+            <w:pPr>
+              <w:spacing w:before="20" w:after="20"/>
+              <w:jc w:val="center"/>
+            </w:pPr>
+            <w:r/>
+            <w:r>
+              <w:rPr>
+                <w:b/>
+                <w:sz w:val="18"/>
+              </w:rPr>
+              <w:t>Udaljenost</w:t>
+            </w:r>
+          </w:p>
+        </w:tc>
+        <w:tc>
+          <w:tcPr>
+            <w:tcW w:type="dxa" w:w="1587"/>
+            <w:shd w:val="clear" w:color="auto" w:fill="BBBBBB"/>
+          </w:tcPr>
+          <w:p>
+            <w:pPr>
+              <w:spacing w:before="20" w:after="20"/>
+              <w:jc w:val="center"/>
+            </w:pPr>
+            <w:r/>
+            <w:r>
+              <w:rPr>
+                <w:b/>
+                <w:sz w:val="18"/>
+              </w:rPr>
+              <w:t>Do</w:t>
+            </w:r>
+          </w:p>
+        </w:tc>
+        <w:tc>
+          <w:tcPr>
+            <w:tcW w:type="dxa" w:w="4480"/>
+            <w:shd w:val="clear" w:color="auto" w:fill="BBBBBB"/>
+          </w:tcPr>
+          <w:p>
+            <w:pPr>
+              <w:spacing w:before="20" w:after="20"/>
+              <w:jc w:val="center"/>
+            </w:pPr>
+            <w:r/>
+            <w:r>
+              <w:rPr>
+                <w:b/>
+                <w:sz w:val="18"/>
+              </w:rPr>
+              <w:t>Opis odredišne KT</w:t>
+            </w:r>
+          </w:p>
+        </w:tc>
+      </w:tr>
+      <w:tr>
+        <w:tc>
+          <w:tcPr>
+            <w:tcW w:type="dxa" w:w="397"/>
+          </w:tcPr>
+          <w:p>
+            <w:pPr>
+              <w:spacing w:before="20" w:after="20"/>
+              <w:jc w:val="center"/>
+            </w:pPr>
+            <w:r/>
+            <w:r>
+              <w:rPr>
+                <w:b w:val="0"/>
+                <w:sz w:val="18"/>
+              </w:rPr>
+              <w:t>1</w:t>
+            </w:r>
+          </w:p>
+        </w:tc>
+        <w:tc>
+          <w:tcPr>
+            <w:tcW w:type="dxa" w:w="1587"/>
+          </w:tcPr>
+          <w:p>
+            <w:pPr>
+              <w:spacing w:before="20" w:after="20"/>
+              <w:jc w:val="left"/>
+            </w:pPr>
+            <w:r/>
+            <w:r>
+              <w:rPr>
+                <w:b w:val="0"/>
+                <w:sz w:val="18"/>
+              </w:rPr>
+              <w:t>DOM</w:t>
+            </w:r>
+          </w:p>
+        </w:tc>
+        <w:tc>
+          <w:tcPr>
+            <w:tcW w:type="dxa" w:w="907"/>
+          </w:tcPr>
+          <w:p>
+            <w:pPr>
+              <w:spacing w:before="20" w:after="20"/>
+              <w:jc w:val="center"/>
+            </w:pPr>
+            <w:r/>
+            <w:r>
+              <w:rPr>
+                <w:b w:val="0"/>
+                <w:sz w:val="18"/>
+              </w:rPr>
+              <w:t>6°</w:t>
+            </w:r>
+          </w:p>
+        </w:tc>
+        <w:tc>
+          <w:tcPr>
+            <w:tcW w:type="dxa" w:w="1247"/>
+          </w:tcPr>
+          <w:p>
+            <w:pPr>
+              <w:spacing w:before="20" w:after="20"/>
+              <w:jc w:val="center"/>
+            </w:pPr>
+            <w:r/>
+            <w:r>
+              <w:rPr>
+                <w:b w:val="0"/>
+                <w:sz w:val="18"/>
+              </w:rPr>
+              <w:t>981 m</w:t>
+            </w:r>
+          </w:p>
+        </w:tc>
+        <w:tc>
+          <w:tcPr>
+            <w:tcW w:type="dxa" w:w="1587"/>
+          </w:tcPr>
+          <w:p>
+            <w:pPr>
+              <w:spacing w:before="20" w:after="20"/>
+              <w:jc w:val="left"/>
+            </w:pPr>
+            <w:r/>
+            <w:r>
+              <w:rPr>
+                <w:b w:val="0"/>
+                <w:sz w:val="18"/>
+              </w:rPr>
+              <w:t>KT SIB</w:t>
+            </w:r>
+          </w:p>
+        </w:tc>
+        <w:tc>
+          <w:tcPr>
+            <w:tcW w:type="dxa" w:w="4480"/>
+          </w:tcPr>
+          <w:p>
+            <w:pPr>
+              <w:spacing w:before="20" w:after="20"/>
+              <w:jc w:val="left"/>
+            </w:pPr>
+            <w:r/>
+            <w:r>
+              <w:rPr>
+                <w:b w:val="0"/>
+                <w:sz w:val="18"/>
+              </w:rPr>
+              <w:t>Raskrižje dviju cesta</w:t>
+            </w:r>
+          </w:p>
+        </w:tc>
+      </w:tr>
+      <w:tr>
+        <w:tc>
+          <w:tcPr>
+            <w:tcW w:type="dxa" w:w="397"/>
+          </w:tcPr>
+          <w:p>
+            <w:pPr>
+              <w:spacing w:before="20" w:after="20"/>
+              <w:jc w:val="center"/>
+            </w:pPr>
+            <w:r/>
+            <w:r>
+              <w:rPr>
+                <w:b w:val="0"/>
+                <w:sz w:val="18"/>
+              </w:rPr>
+              <w:t>2</w:t>
+            </w:r>
+          </w:p>
+        </w:tc>
+        <w:tc>
+          <w:tcPr>
+            <w:tcW w:type="dxa" w:w="1587"/>
+          </w:tcPr>
+          <w:p>
+            <w:pPr>
+              <w:spacing w:before="20" w:after="20"/>
+              <w:jc w:val="left"/>
+            </w:pPr>
+            <w:r/>
+            <w:r>
+              <w:rPr>
+                <w:b w:val="0"/>
+                <w:sz w:val="18"/>
+              </w:rPr>
+              <w:t>KT SIB</w:t>
+            </w:r>
+          </w:p>
+        </w:tc>
+        <w:tc>
+          <w:tcPr>
+            <w:tcW w:type="dxa" w:w="907"/>
+          </w:tcPr>
+          <w:p>
+            <w:pPr>
+              <w:spacing w:before="20" w:after="20"/>
+              <w:jc w:val="center"/>
+            </w:pPr>
+            <w:r/>
+            <w:r>
+              <w:rPr>
+                <w:b w:val="0"/>
+                <w:sz w:val="18"/>
+              </w:rPr>
+              <w:t>287°</w:t>
+            </w:r>
+          </w:p>
+        </w:tc>
+        <w:tc>
+          <w:tcPr>
+            <w:tcW w:type="dxa" w:w="1247"/>
+          </w:tcPr>
+          <w:p>
+            <w:pPr>
+              <w:spacing w:before="20" w:after="20"/>
+              <w:jc w:val="center"/>
+            </w:pPr>
+            <w:r/>
+            <w:r>
+              <w:rPr>
+                <w:b w:val="0"/>
+                <w:sz w:val="18"/>
+              </w:rPr>
+              <w:t>587 m</w:t>
+            </w:r>
+          </w:p>
+        </w:tc>
+        <w:tc>
+          <w:tcPr>
+            <w:tcW w:type="dxa" w:w="1587"/>
+          </w:tcPr>
+          <w:p>
+            <w:pPr>
+              <w:spacing w:before="20" w:after="20"/>
+              <w:jc w:val="left"/>
+            </w:pPr>
+            <w:r/>
+            <w:r>
+              <w:rPr>
+                <w:b w:val="0"/>
+                <w:sz w:val="18"/>
+              </w:rPr>
+              <w:t>KT SA</w:t>
+            </w:r>
+          </w:p>
+        </w:tc>
+        <w:tc>
+          <w:tcPr>
+            <w:tcW w:type="dxa" w:w="4480"/>
+          </w:tcPr>
+          <w:p>
+            <w:pPr>
+              <w:spacing w:before="20" w:after="20"/>
+              <w:jc w:val="left"/>
+            </w:pPr>
+            <w:r/>
+            <w:r>
+              <w:rPr>
+                <w:b w:val="0"/>
+                <w:sz w:val="18"/>
+              </w:rPr>
+              <w:t>Raskrižje planinske staze i puta</w:t>
+            </w:r>
+          </w:p>
+        </w:tc>
+      </w:tr>
+      <w:tr>
+        <w:tc>
+          <w:tcPr>
+            <w:tcW w:type="dxa" w:w="397"/>
+          </w:tcPr>
+          <w:p>
+            <w:pPr>
+              <w:spacing w:before="20" w:after="20"/>
+              <w:jc w:val="center"/>
+            </w:pPr>
+            <w:r/>
+            <w:r>
+              <w:rPr>
+                <w:b w:val="0"/>
+                <w:sz w:val="18"/>
+              </w:rPr>
+              <w:t>3</w:t>
+            </w:r>
+          </w:p>
+        </w:tc>
+        <w:tc>
+          <w:tcPr>
+            <w:tcW w:type="dxa" w:w="1587"/>
+          </w:tcPr>
+          <w:p>
+            <w:pPr>
+              <w:spacing w:before="20" w:after="20"/>
+              <w:jc w:val="left"/>
+            </w:pPr>
+            <w:r/>
+            <w:r>
+              <w:rPr>
+                <w:b w:val="0"/>
+                <w:sz w:val="18"/>
+              </w:rPr>
+              <w:t>KT SA</w:t>
+            </w:r>
+          </w:p>
+        </w:tc>
+        <w:tc>
+          <w:tcPr>
+            <w:tcW w:type="dxa" w:w="907"/>
+          </w:tcPr>
+          <w:p>
+            <w:pPr>
+              <w:spacing w:before="20" w:after="20"/>
+              <w:jc w:val="center"/>
+            </w:pPr>
+            <w:r/>
+            <w:r>
+              <w:rPr>
+                <w:b w:val="0"/>
+                <w:sz w:val="18"/>
+              </w:rPr>
+              <w:t>181°</w:t>
+            </w:r>
+          </w:p>
+        </w:tc>
+        <w:tc>
+          <w:tcPr>
+            <w:tcW w:type="dxa" w:w="1247"/>
+          </w:tcPr>
+          <w:p>
+            <w:pPr>
+              <w:spacing w:before="20" w:after="20"/>
+              <w:jc w:val="center"/>
+            </w:pPr>
+            <w:r/>
+            <w:r>
+              <w:rPr>
+                <w:b w:val="0"/>
+                <w:sz w:val="18"/>
+              </w:rPr>
+              <w:t>754 m</w:t>
+            </w:r>
+          </w:p>
+        </w:tc>
+        <w:tc>
+          <w:tcPr>
+            <w:tcW w:type="dxa" w:w="1587"/>
+          </w:tcPr>
+          <w:p>
+            <w:pPr>
+              <w:spacing w:before="20" w:after="20"/>
+              <w:jc w:val="left"/>
+            </w:pPr>
+            <w:r/>
+            <w:r>
+              <w:rPr>
+                <w:b w:val="0"/>
+                <w:sz w:val="18"/>
+              </w:rPr>
+              <w:t>KT JZA</w:t>
+            </w:r>
+          </w:p>
+        </w:tc>
+        <w:tc>
+          <w:tcPr>
+            <w:tcW w:type="dxa" w:w="4480"/>
+          </w:tcPr>
+          <w:p>
+            <w:pPr>
+              <w:spacing w:before="20" w:after="20"/>
+              <w:jc w:val="left"/>
+            </w:pPr>
+            <w:r/>
+            <w:r>
+              <w:rPr>
+                <w:b w:val="0"/>
+                <w:sz w:val="18"/>
+              </w:rPr>
+              <w:t>Raskrižje planinske staze i potoka</w:t>
+            </w:r>
+          </w:p>
+        </w:tc>
+      </w:tr>
+      <w:tr>
+        <w:tc>
+          <w:tcPr>
+            <w:tcW w:type="dxa" w:w="397"/>
+          </w:tcPr>
+          <w:p>
+            <w:pPr>
+              <w:spacing w:before="20" w:after="20"/>
+              <w:jc w:val="center"/>
+            </w:pPr>
+            <w:r/>
+            <w:r>
+              <w:rPr>
+                <w:b w:val="0"/>
+                <w:sz w:val="18"/>
+              </w:rPr>
+              <w:t>4</w:t>
+            </w:r>
+          </w:p>
+        </w:tc>
+        <w:tc>
+          <w:tcPr>
+            <w:tcW w:type="dxa" w:w="1587"/>
+          </w:tcPr>
+          <w:p>
+            <w:pPr>
+              <w:spacing w:before="20" w:after="20"/>
+              <w:jc w:val="left"/>
+            </w:pPr>
+            <w:r/>
+            <w:r>
+              <w:rPr>
+                <w:b w:val="0"/>
+                <w:sz w:val="18"/>
+              </w:rPr>
+              <w:t>KT JZA</w:t>
+            </w:r>
+          </w:p>
+        </w:tc>
+        <w:tc>
+          <w:tcPr>
+            <w:tcW w:type="dxa" w:w="907"/>
+          </w:tcPr>
+          <w:p>
+            <w:pPr>
+              <w:spacing w:before="20" w:after="20"/>
+              <w:jc w:val="center"/>
+            </w:pPr>
+            <w:r/>
+            <w:r>
+              <w:rPr>
+                <w:b w:val="0"/>
+                <w:sz w:val="18"/>
+              </w:rPr>
+              <w:t>132°</w:t>
+            </w:r>
+          </w:p>
+        </w:tc>
+        <w:tc>
+          <w:tcPr>
+            <w:tcW w:type="dxa" w:w="1247"/>
+          </w:tcPr>
+          <w:p>
+            <w:pPr>
+              <w:spacing w:before="20" w:after="20"/>
+              <w:jc w:val="center"/>
+            </w:pPr>
+            <w:r/>
+            <w:r>
+              <w:rPr>
+                <w:b w:val="0"/>
+                <w:sz w:val="18"/>
+              </w:rPr>
+              <w:t>375 m</w:t>
+            </w:r>
+          </w:p>
+        </w:tc>
+        <w:tc>
+          <w:tcPr>
+            <w:tcW w:type="dxa" w:w="1587"/>
+          </w:tcPr>
+          <w:p>
+            <w:pPr>
+              <w:spacing w:before="20" w:after="20"/>
+              <w:jc w:val="left"/>
+            </w:pPr>
+            <w:r/>
+            <w:r>
+              <w:rPr>
+                <w:b w:val="0"/>
+                <w:sz w:val="18"/>
+              </w:rPr>
+              <w:t>KT JA</w:t>
+            </w:r>
+          </w:p>
+        </w:tc>
+        <w:tc>
+          <w:tcPr>
+            <w:tcW w:type="dxa" w:w="4480"/>
+          </w:tcPr>
+          <w:p>
+            <w:pPr>
+              <w:spacing w:before="20" w:after="20"/>
+              <w:jc w:val="left"/>
+            </w:pPr>
+            <w:r/>
+            <w:r>
+              <w:rPr>
+                <w:b w:val="0"/>
+                <w:sz w:val="18"/>
+              </w:rPr>
+              <w:t>Raskrižje ceste i planinske staze</w:t>
+            </w:r>
+          </w:p>
+        </w:tc>
+      </w:tr>
+      <w:tr>
+        <w:tc>
+          <w:tcPr>
+            <w:tcW w:type="dxa" w:w="397"/>
+          </w:tcPr>
+          <w:p>
+            <w:pPr>
+              <w:spacing w:before="20" w:after="20"/>
+              <w:jc w:val="center"/>
+            </w:pPr>
+            <w:r/>
+            <w:r>
+              <w:rPr>
+                <w:b w:val="0"/>
+                <w:sz w:val="18"/>
+              </w:rPr>
+              <w:t>5</w:t>
+            </w:r>
+          </w:p>
+        </w:tc>
+        <w:tc>
+          <w:tcPr>
+            <w:tcW w:type="dxa" w:w="1587"/>
+          </w:tcPr>
+          <w:p>
+            <w:pPr>
+              <w:spacing w:before="20" w:after="20"/>
+              <w:jc w:val="left"/>
+            </w:pPr>
+            <w:r/>
+            <w:r>
+              <w:rPr>
+                <w:b w:val="0"/>
+                <w:sz w:val="18"/>
+              </w:rPr>
+              <w:t>KT JA</w:t>
+            </w:r>
+          </w:p>
+        </w:tc>
+        <w:tc>
+          <w:tcPr>
+            <w:tcW w:type="dxa" w:w="907"/>
+          </w:tcPr>
+          <w:p>
+            <w:pPr>
+              <w:spacing w:before="20" w:after="20"/>
+              <w:jc w:val="center"/>
+            </w:pPr>
+            <w:r/>
+            <w:r>
+              <w:rPr>
+                <w:b w:val="0"/>
+                <w:sz w:val="18"/>
+              </w:rPr>
+              <w:t>128°</w:t>
+            </w:r>
+          </w:p>
+        </w:tc>
+        <w:tc>
+          <w:tcPr>
+            <w:tcW w:type="dxa" w:w="1247"/>
+          </w:tcPr>
+          <w:p>
+            <w:pPr>
+              <w:spacing w:before="20" w:after="20"/>
+              <w:jc w:val="center"/>
+            </w:pPr>
+            <w:r/>
+            <w:r>
+              <w:rPr>
+                <w:b w:val="0"/>
+                <w:sz w:val="18"/>
+              </w:rPr>
+              <w:t>236 m</w:t>
+            </w:r>
+          </w:p>
+        </w:tc>
+        <w:tc>
+          <w:tcPr>
+            <w:tcW w:type="dxa" w:w="1587"/>
+          </w:tcPr>
+          <w:p>
+            <w:pPr>
+              <w:spacing w:before="20" w:after="20"/>
+              <w:jc w:val="left"/>
+            </w:pPr>
+            <w:r/>
+            <w:r>
+              <w:rPr>
+                <w:b w:val="0"/>
+                <w:sz w:val="18"/>
+              </w:rPr>
+              <w:t>DOM</w:t>
+            </w:r>
+          </w:p>
+        </w:tc>
+        <w:tc>
+          <w:tcPr>
+            <w:tcW w:type="dxa" w:w="4480"/>
+          </w:tcPr>
+          <w:p>
+            <w:pPr>
+              <w:spacing w:before="20" w:after="20"/>
+              <w:jc w:val="left"/>
+            </w:pPr>
+            <w:r/>
+            <w:r>
+              <w:rPr>
+                <w:b w:val="0"/>
+                <w:sz w:val="18"/>
+              </w:rPr>
+              <w:t>Planinarski dom</w:t>
+            </w:r>
+          </w:p>
+        </w:tc>
+      </w:tr>
+    </w:tbl>
+    <w:p>
+      <w:pPr>
+        <w:spacing w:before="0" w:after="0"/>
+      </w:pPr>
+      <w:r>
+        <w:br w:type="page"/>
+      </w:r>
+    </w:p>
+    <w:tbl>
+      <w:tblPr>
+        <w:tblW w:type="auto" w:w="0"/>
+        <w:jc w:val="center"/>
+        <w:tblLook w:firstColumn="1" w:firstRow="1" w:lastColumn="0" w:lastRow="0" w:noHBand="0" w:noVBand="1" w:val="04A0"/>
+      </w:tblPr>
+      <w:tblGrid>
+        <w:gridCol w:w="2041"/>
+        <w:gridCol w:w="2041"/>
+        <w:gridCol w:w="2041"/>
+        <w:gridCol w:w="2041"/>
+        <w:gridCol w:w="2041"/>
+      </w:tblGrid>
+      <w:tr>
+        <w:trPr>
+          <w:trHeight w:val="1814" w:hRule="exact"/>
+        </w:trPr>
+        <w:tc>
+          <w:tcPr>
+            <w:tcW w:type="dxa" w:w="2041"/>
+            <w:tcBorders>
+              <w:top w:val="single" w:sz="18" w:color="000000"/>
+              <w:left w:val="single" w:sz="18" w:color="000000"/>
+              <w:bottom w:val="single" w:sz="18" w:color="000000"/>
+              <w:right w:val="single" w:sz="18" w:color="000000"/>
+            </w:tcBorders>
+          </w:tcPr>
+          <w:p/>
+        </w:tc>
+        <w:tc>
+          <w:tcPr>
+            <w:tcW w:type="dxa" w:w="2041"/>
+            <w:tcBorders>
+              <w:top w:val="single" w:sz="18" w:color="000000"/>
+              <w:left w:val="single" w:sz="18" w:color="000000"/>
+              <w:bottom w:val="single" w:sz="18" w:color="000000"/>
+              <w:right w:val="single" w:sz="18" w:color="000000"/>
+            </w:tcBorders>
+          </w:tcPr>
+          <w:p/>
+        </w:tc>
+        <w:tc>
+          <w:tcPr>
+            <w:tcW w:type="dxa" w:w="2041"/>
+            <w:tcBorders>
+              <w:top w:val="single" w:sz="18" w:color="000000"/>
+              <w:left w:val="single" w:sz="18" w:color="000000"/>
+              <w:bottom w:val="single" w:sz="18" w:color="000000"/>
+              <w:right w:val="single" w:sz="18" w:color="000000"/>
+            </w:tcBorders>
+          </w:tcPr>
+          <w:p/>
+        </w:tc>
+        <w:tc>
+          <w:tcPr>
+            <w:tcW w:type="dxa" w:w="2041"/>
+            <w:tcBorders>
+              <w:top w:val="single" w:sz="18" w:color="000000"/>
+              <w:left w:val="single" w:sz="18" w:color="000000"/>
+              <w:bottom w:val="single" w:sz="18" w:color="000000"/>
+              <w:right w:val="single" w:sz="18" w:color="000000"/>
+            </w:tcBorders>
+          </w:tcPr>
+          <w:p/>
+        </w:tc>
+        <w:tc>
+          <w:tcPr>
+            <w:tcW w:type="dxa" w:w="2041"/>
+            <w:tcBorders>
+              <w:top w:val="single" w:sz="18" w:color="000000"/>
+              <w:left w:val="single" w:sz="18" w:color="000000"/>
+              <w:bottom w:val="single" w:sz="18" w:color="000000"/>
+              <w:right w:val="single" w:sz="18" w:color="000000"/>
+            </w:tcBorders>
+          </w:tcPr>
+          <w:p/>
+        </w:tc>
+      </w:tr>
+      <w:tr>
+        <w:trPr>
+          <w:trHeight w:val="397" w:hRule="exact"/>
+        </w:trPr>
+        <w:tc>
+          <w:tcPr>
+            <w:tcW w:type="dxa" w:w="2041"/>
+            <w:tcBorders>
+              <w:top w:val="single" w:sz="12" w:color="000000"/>
+              <w:left w:val="single" w:sz="12" w:color="000000"/>
+              <w:bottom w:val="single" w:sz="12" w:color="000000"/>
+              <w:right w:val="single" w:sz="12" w:color="000000"/>
+            </w:tcBorders>
+            <w:shd w:val="clear" w:color="auto" w:fill="DDDDDD"/>
+          </w:tcPr>
+          <w:p>
+            <w:pPr>
+              <w:spacing w:before="20" w:after="20"/>
+              <w:jc w:val="center"/>
+            </w:pPr>
+            <w:r/>
+            <w:r>
+              <w:rPr>
+                <w:b/>
+                <w:sz w:val="16"/>
+              </w:rPr>
+              <w:t>DOM</w:t>
+            </w:r>
+          </w:p>
+        </w:tc>
+        <w:tc>
+          <w:tcPr>
+            <w:tcW w:type="dxa" w:w="2041"/>
+            <w:tcBorders>
+              <w:top w:val="single" w:sz="12" w:color="000000"/>
+              <w:left w:val="single" w:sz="12" w:color="000000"/>
+              <w:bottom w:val="single" w:sz="12" w:color="000000"/>
+              <w:right w:val="single" w:sz="12" w:color="000000"/>
+            </w:tcBorders>
+            <w:shd w:val="clear" w:color="auto" w:fill="DDDDDD"/>
+          </w:tcPr>
+          <w:p>
+            <w:pPr>
+              <w:spacing w:before="20" w:after="20"/>
+              <w:jc w:val="center"/>
+            </w:pPr>
+            <w:r/>
+            <w:r>
+              <w:rPr>
+                <w:b/>
+                <w:sz w:val="16"/>
+              </w:rPr>
+              <w:t>KT SIB</w:t>
+            </w:r>
+          </w:p>
+        </w:tc>
+        <w:tc>
+          <w:tcPr>
+            <w:tcW w:type="dxa" w:w="2041"/>
+            <w:tcBorders>
+              <w:top w:val="single" w:sz="12" w:color="000000"/>
+              <w:left w:val="single" w:sz="12" w:color="000000"/>
+              <w:bottom w:val="single" w:sz="12" w:color="000000"/>
+              <w:right w:val="single" w:sz="12" w:color="000000"/>
+            </w:tcBorders>
+            <w:shd w:val="clear" w:color="auto" w:fill="DDDDDD"/>
+          </w:tcPr>
+          <w:p>
+            <w:pPr>
+              <w:spacing w:before="20" w:after="20"/>
+              <w:jc w:val="center"/>
+            </w:pPr>
+            <w:r/>
+            <w:r>
+              <w:rPr>
+                <w:b/>
+                <w:sz w:val="16"/>
+              </w:rPr>
+              <w:t>KT SA</w:t>
+            </w:r>
+          </w:p>
+        </w:tc>
+        <w:tc>
+          <w:tcPr>
+            <w:tcW w:type="dxa" w:w="2041"/>
+            <w:tcBorders>
+              <w:top w:val="single" w:sz="12" w:color="000000"/>
+              <w:left w:val="single" w:sz="12" w:color="000000"/>
+              <w:bottom w:val="single" w:sz="12" w:color="000000"/>
+              <w:right w:val="single" w:sz="12" w:color="000000"/>
+            </w:tcBorders>
+            <w:shd w:val="clear" w:color="auto" w:fill="DDDDDD"/>
+          </w:tcPr>
+          <w:p>
+            <w:pPr>
+              <w:spacing w:before="20" w:after="20"/>
+              <w:jc w:val="center"/>
+            </w:pPr>
+            <w:r/>
+            <w:r>
+              <w:rPr>
+                <w:b/>
+                <w:sz w:val="16"/>
+              </w:rPr>
+              <w:t>KT SZA</w:t>
+            </w:r>
+          </w:p>
+        </w:tc>
+        <w:tc>
+          <w:tcPr>
+            <w:tcW w:type="dxa" w:w="2041"/>
+            <w:tcBorders>
+              <w:top w:val="single" w:sz="12" w:color="000000"/>
+              <w:left w:val="single" w:sz="12" w:color="000000"/>
+              <w:bottom w:val="single" w:sz="12" w:color="000000"/>
+              <w:right w:val="single" w:sz="12" w:color="000000"/>
+            </w:tcBorders>
+            <w:shd w:val="clear" w:color="auto" w:fill="DDDDDD"/>
+          </w:tcPr>
+          <w:p>
+            <w:pPr>
+              <w:spacing w:before="20" w:after="20"/>
+              <w:jc w:val="center"/>
+            </w:pPr>
+            <w:r/>
+            <w:r>
+              <w:rPr>
+                <w:b/>
+                <w:sz w:val="16"/>
+              </w:rPr>
+              <w:t>KT JZA</w:t>
+            </w:r>
+          </w:p>
+        </w:tc>
+      </w:tr>
+    </w:tbl>
+    <w:p>
+      <w:pPr>
+        <w:spacing w:before="160" w:after="0"/>
+        <w:jc w:val="center"/>
+      </w:pPr>
+      <w:r>
+        <w:rPr>
+          <w:b w:val="0"/>
+          <w:sz w:val="24"/>
+        </w:rPr>
+        <w:t>Vježba orijentacije — Okić</w:t>
+      </w:r>
+    </w:p>
+    <w:p>
+      <w:pPr>
+        <w:spacing w:before="40" w:after="120"/>
+        <w:jc w:val="center"/>
+      </w:pPr>
+      <w:r>
+        <w:rPr>
+          <w:b/>
+          <w:sz w:val="30"/>
+        </w:rPr>
+        <w:t>Grupa 6</w:t>
+      </w:r>
+    </w:p>
+    <w:p>
+      <w:pPr>
+        <w:spacing w:before="0" w:after="40"/>
+        <w:jc w:val="left"/>
+      </w:pPr>
+      <w:r>
+        <w:rPr>
+          <w:b/>
+          <w:sz w:val="18"/>
+        </w:rPr>
+        <w:t>Upute:</w:t>
+      </w:r>
+    </w:p>
+    <w:p>
+      <w:pPr>
+        <w:pStyle w:val="ListBullet"/>
+        <w:spacing w:before="0" w:after="0"/>
+      </w:pPr>
+      <w:r>
+        <w:rPr>
+          <w:sz w:val="18"/>
+        </w:rPr>
+        <w:t>Staza kreće i završava na DOM-u (planinarskom domu).</w:t>
+      </w:r>
+    </w:p>
+    <w:p>
+      <w:pPr>
+        <w:pStyle w:val="ListBullet"/>
+        <w:spacing w:before="0" w:after="0"/>
+      </w:pPr>
+      <w:r>
+        <w:rPr>
+          <w:sz w:val="18"/>
+        </w:rPr>
+        <w:t>Koristeći tablicu segmenata i kompas, ucrtaj sve kontrolne točke na karti. Voditelj vježbe mora potvrditi položaj svih točaka prije polaska na teren.</w:t>
+      </w:r>
+    </w:p>
+    <w:p>
+      <w:pPr>
+        <w:pStyle w:val="ListBullet"/>
+        <w:spacing w:before="0" w:after="0"/>
+      </w:pPr>
+      <w:r>
+        <w:rPr>
+          <w:sz w:val="18"/>
+        </w:rPr>
+        <w:t>Na svakom KT-u dokaži prolazak bušenjem kartona bušačem koji se nalazi na toj točki.</w:t>
+      </w:r>
+    </w:p>
+    <w:p>
+      <w:pPr>
+        <w:pStyle w:val="ListBullet"/>
+        <w:spacing w:before="0" w:after="0"/>
+      </w:pPr>
+      <w:r>
+        <w:rPr>
+          <w:sz w:val="18"/>
+        </w:rPr>
+        <w:t>Svaki puta kada se buši karton, druga osoba iz grupe SMS-om dojavuje voditelju vježbe trenutne GPS koordinate. Koordinate su dostupne u navigacijskoj aplikaciji na mobitelu.</w:t>
+      </w:r>
+    </w:p>
+    <w:p>
+      <w:pPr>
+        <w:pStyle w:val="ListBullet"/>
+        <w:spacing w:before="0" w:after="0"/>
+      </w:pPr>
+      <w:r>
+        <w:rPr>
+          <w:sz w:val="18"/>
+        </w:rPr>
+        <w:t>Na terenu je dopušteno koristiti elektroničku navigaciju (mobitel, GPS aplikacija).</w:t>
+      </w:r>
+    </w:p>
+    <w:p>
+      <w:pPr>
+        <w:pStyle w:val="ListBullet"/>
+        <w:spacing w:before="0" w:after="0"/>
+      </w:pPr>
+      <w:r>
+        <w:rPr>
+          <w:sz w:val="18"/>
+        </w:rPr>
+        <w:t>Kretati se smije samo po označenim planinarskim stazama, cestama i šumskim putovima.</w:t>
+      </w:r>
+    </w:p>
+    <w:p>
+      <w:pPr>
+        <w:spacing w:before="160" w:after="40"/>
+        <w:jc w:val="left"/>
+      </w:pPr>
+      <w:r>
+        <w:rPr>
+          <w:b/>
+          <w:sz w:val="18"/>
+        </w:rPr>
+        <w:t>Segmenti rute:</w:t>
+      </w:r>
+    </w:p>
+    <w:tbl>
+      <w:tblPr>
+        <w:tblStyle w:val="TableGrid"/>
+        <w:tblW w:type="auto" w:w="0"/>
+        <w:jc w:val="center"/>
+        <w:tblLook w:firstColumn="1" w:firstRow="1" w:lastColumn="0" w:lastRow="0" w:noHBand="0" w:noVBand="1" w:val="04A0"/>
+      </w:tblPr>
+      <w:tblGrid>
+        <w:gridCol w:w="1701"/>
+        <w:gridCol w:w="1701"/>
+        <w:gridCol w:w="1701"/>
+        <w:gridCol w:w="1701"/>
+        <w:gridCol w:w="1701"/>
+        <w:gridCol w:w="1701"/>
+      </w:tblGrid>
+      <w:tr>
+        <w:tc>
+          <w:tcPr>
+            <w:tcW w:type="dxa" w:w="397"/>
+            <w:shd w:val="clear" w:color="auto" w:fill="BBBBBB"/>
+          </w:tcPr>
+          <w:p>
+            <w:pPr>
+              <w:spacing w:before="20" w:after="20"/>
+              <w:jc w:val="center"/>
+            </w:pPr>
+            <w:r/>
+            <w:r>
+              <w:rPr>
+                <w:b/>
+                <w:sz w:val="18"/>
+              </w:rPr>
+              <w:t>#</w:t>
+            </w:r>
+          </w:p>
+        </w:tc>
+        <w:tc>
+          <w:tcPr>
+            <w:tcW w:type="dxa" w:w="1587"/>
+            <w:shd w:val="clear" w:color="auto" w:fill="BBBBBB"/>
+          </w:tcPr>
+          <w:p>
+            <w:pPr>
+              <w:spacing w:before="20" w:after="20"/>
+              <w:jc w:val="center"/>
+            </w:pPr>
+            <w:r/>
+            <w:r>
+              <w:rPr>
+                <w:b/>
+                <w:sz w:val="18"/>
+              </w:rPr>
+              <w:t>Od</w:t>
+            </w:r>
+          </w:p>
+        </w:tc>
+        <w:tc>
+          <w:tcPr>
+            <w:tcW w:type="dxa" w:w="907"/>
+            <w:shd w:val="clear" w:color="auto" w:fill="BBBBBB"/>
+          </w:tcPr>
+          <w:p>
+            <w:pPr>
+              <w:spacing w:before="20" w:after="20"/>
+              <w:jc w:val="center"/>
+            </w:pPr>
+            <w:r/>
+            <w:r>
+              <w:rPr>
+                <w:b/>
+                <w:sz w:val="18"/>
+              </w:rPr>
+              <w:t>Azimut</w:t>
+            </w:r>
+          </w:p>
+        </w:tc>
+        <w:tc>
+          <w:tcPr>
+            <w:tcW w:type="dxa" w:w="1247"/>
+            <w:shd w:val="clear" w:color="auto" w:fill="BBBBBB"/>
+          </w:tcPr>
+          <w:p>
+            <w:pPr>
+              <w:spacing w:before="20" w:after="20"/>
+              <w:jc w:val="center"/>
+            </w:pPr>
+            <w:r/>
+            <w:r>
+              <w:rPr>
+                <w:b/>
+                <w:sz w:val="18"/>
+              </w:rPr>
+              <w:t>Udaljenost</w:t>
+            </w:r>
+          </w:p>
+        </w:tc>
+        <w:tc>
+          <w:tcPr>
+            <w:tcW w:type="dxa" w:w="1587"/>
+            <w:shd w:val="clear" w:color="auto" w:fill="BBBBBB"/>
+          </w:tcPr>
+          <w:p>
+            <w:pPr>
+              <w:spacing w:before="20" w:after="20"/>
+              <w:jc w:val="center"/>
+            </w:pPr>
+            <w:r/>
+            <w:r>
+              <w:rPr>
+                <w:b/>
+                <w:sz w:val="18"/>
+              </w:rPr>
+              <w:t>Do</w:t>
+            </w:r>
+          </w:p>
+        </w:tc>
+        <w:tc>
+          <w:tcPr>
+            <w:tcW w:type="dxa" w:w="4480"/>
+            <w:shd w:val="clear" w:color="auto" w:fill="BBBBBB"/>
+          </w:tcPr>
+          <w:p>
+            <w:pPr>
+              <w:spacing w:before="20" w:after="20"/>
+              <w:jc w:val="center"/>
+            </w:pPr>
+            <w:r/>
+            <w:r>
+              <w:rPr>
+                <w:b/>
+                <w:sz w:val="18"/>
+              </w:rPr>
+              <w:t>Opis odredišne KT</w:t>
+            </w:r>
+          </w:p>
+        </w:tc>
+      </w:tr>
+      <w:tr>
+        <w:tc>
+          <w:tcPr>
+            <w:tcW w:type="dxa" w:w="397"/>
+          </w:tcPr>
+          <w:p>
+            <w:pPr>
+              <w:spacing w:before="20" w:after="20"/>
+              <w:jc w:val="center"/>
+            </w:pPr>
+            <w:r/>
+            <w:r>
+              <w:rPr>
+                <w:b w:val="0"/>
+                <w:sz w:val="18"/>
+              </w:rPr>
+              <w:t>1</w:t>
+            </w:r>
+          </w:p>
+        </w:tc>
+        <w:tc>
+          <w:tcPr>
+            <w:tcW w:type="dxa" w:w="1587"/>
+          </w:tcPr>
+          <w:p>
+            <w:pPr>
+              <w:spacing w:before="20" w:after="20"/>
+              <w:jc w:val="left"/>
+            </w:pPr>
+            <w:r/>
+            <w:r>
+              <w:rPr>
+                <w:b w:val="0"/>
+                <w:sz w:val="18"/>
+              </w:rPr>
+              <w:t>DOM</w:t>
+            </w:r>
+          </w:p>
+        </w:tc>
+        <w:tc>
+          <w:tcPr>
+            <w:tcW w:type="dxa" w:w="907"/>
+          </w:tcPr>
+          <w:p>
+            <w:pPr>
+              <w:spacing w:before="20" w:after="20"/>
+              <w:jc w:val="center"/>
+            </w:pPr>
+            <w:r/>
+            <w:r>
+              <w:rPr>
+                <w:b w:val="0"/>
+                <w:sz w:val="18"/>
+              </w:rPr>
+              <w:t>6°</w:t>
+            </w:r>
+          </w:p>
+        </w:tc>
+        <w:tc>
+          <w:tcPr>
+            <w:tcW w:type="dxa" w:w="1247"/>
+          </w:tcPr>
+          <w:p>
+            <w:pPr>
+              <w:spacing w:before="20" w:after="20"/>
+              <w:jc w:val="center"/>
+            </w:pPr>
+            <w:r/>
+            <w:r>
+              <w:rPr>
+                <w:b w:val="0"/>
+                <w:sz w:val="18"/>
+              </w:rPr>
+              <w:t>981 m</w:t>
+            </w:r>
+          </w:p>
+        </w:tc>
+        <w:tc>
+          <w:tcPr>
+            <w:tcW w:type="dxa" w:w="1587"/>
+          </w:tcPr>
+          <w:p>
+            <w:pPr>
+              <w:spacing w:before="20" w:after="20"/>
+              <w:jc w:val="left"/>
+            </w:pPr>
+            <w:r/>
+            <w:r>
+              <w:rPr>
+                <w:b w:val="0"/>
+                <w:sz w:val="18"/>
+              </w:rPr>
+              <w:t>KT SIB</w:t>
+            </w:r>
+          </w:p>
+        </w:tc>
+        <w:tc>
+          <w:tcPr>
+            <w:tcW w:type="dxa" w:w="4480"/>
+          </w:tcPr>
+          <w:p>
+            <w:pPr>
+              <w:spacing w:before="20" w:after="20"/>
+              <w:jc w:val="left"/>
+            </w:pPr>
+            <w:r/>
+            <w:r>
+              <w:rPr>
+                <w:b w:val="0"/>
+                <w:sz w:val="18"/>
+              </w:rPr>
+              <w:t>Raskrižje dviju cesta</w:t>
+            </w:r>
+          </w:p>
+        </w:tc>
+      </w:tr>
+      <w:tr>
+        <w:tc>
+          <w:tcPr>
+            <w:tcW w:type="dxa" w:w="397"/>
+          </w:tcPr>
+          <w:p>
+            <w:pPr>
+              <w:spacing w:before="20" w:after="20"/>
+              <w:jc w:val="center"/>
+            </w:pPr>
+            <w:r/>
+            <w:r>
+              <w:rPr>
+                <w:b w:val="0"/>
+                <w:sz w:val="18"/>
+              </w:rPr>
+              <w:t>2</w:t>
+            </w:r>
+          </w:p>
+        </w:tc>
+        <w:tc>
+          <w:tcPr>
+            <w:tcW w:type="dxa" w:w="1587"/>
+          </w:tcPr>
+          <w:p>
+            <w:pPr>
+              <w:spacing w:before="20" w:after="20"/>
+              <w:jc w:val="left"/>
+            </w:pPr>
+            <w:r/>
+            <w:r>
+              <w:rPr>
+                <w:b w:val="0"/>
+                <w:sz w:val="18"/>
+              </w:rPr>
+              <w:t>KT SIB</w:t>
+            </w:r>
+          </w:p>
+        </w:tc>
+        <w:tc>
+          <w:tcPr>
+            <w:tcW w:type="dxa" w:w="907"/>
+          </w:tcPr>
+          <w:p>
+            <w:pPr>
+              <w:spacing w:before="20" w:after="20"/>
+              <w:jc w:val="center"/>
+            </w:pPr>
+            <w:r/>
+            <w:r>
+              <w:rPr>
+                <w:b w:val="0"/>
+                <w:sz w:val="18"/>
+              </w:rPr>
+              <w:t>287°</w:t>
+            </w:r>
+          </w:p>
+        </w:tc>
+        <w:tc>
+          <w:tcPr>
+            <w:tcW w:type="dxa" w:w="1247"/>
+          </w:tcPr>
+          <w:p>
+            <w:pPr>
+              <w:spacing w:before="20" w:after="20"/>
+              <w:jc w:val="center"/>
+            </w:pPr>
+            <w:r/>
+            <w:r>
+              <w:rPr>
+                <w:b w:val="0"/>
+                <w:sz w:val="18"/>
+              </w:rPr>
+              <w:t>587 m</w:t>
+            </w:r>
+          </w:p>
+        </w:tc>
+        <w:tc>
+          <w:tcPr>
+            <w:tcW w:type="dxa" w:w="1587"/>
+          </w:tcPr>
+          <w:p>
+            <w:pPr>
+              <w:spacing w:before="20" w:after="20"/>
+              <w:jc w:val="left"/>
+            </w:pPr>
+            <w:r/>
+            <w:r>
+              <w:rPr>
+                <w:b w:val="0"/>
+                <w:sz w:val="18"/>
+              </w:rPr>
+              <w:t>KT SA</w:t>
+            </w:r>
+          </w:p>
+        </w:tc>
+        <w:tc>
+          <w:tcPr>
+            <w:tcW w:type="dxa" w:w="4480"/>
+          </w:tcPr>
+          <w:p>
+            <w:pPr>
+              <w:spacing w:before="20" w:after="20"/>
+              <w:jc w:val="left"/>
+            </w:pPr>
+            <w:r/>
+            <w:r>
+              <w:rPr>
+                <w:b w:val="0"/>
+                <w:sz w:val="18"/>
+              </w:rPr>
+              <w:t>Raskrižje planinske staze i puta</w:t>
+            </w:r>
+          </w:p>
+        </w:tc>
+      </w:tr>
+      <w:tr>
+        <w:tc>
+          <w:tcPr>
+            <w:tcW w:type="dxa" w:w="397"/>
+          </w:tcPr>
+          <w:p>
+            <w:pPr>
+              <w:spacing w:before="20" w:after="20"/>
+              <w:jc w:val="center"/>
+            </w:pPr>
+            <w:r/>
+            <w:r>
+              <w:rPr>
+                <w:b w:val="0"/>
+                <w:sz w:val="18"/>
+              </w:rPr>
+              <w:t>3</w:t>
+            </w:r>
+          </w:p>
+        </w:tc>
+        <w:tc>
+          <w:tcPr>
+            <w:tcW w:type="dxa" w:w="1587"/>
+          </w:tcPr>
+          <w:p>
+            <w:pPr>
+              <w:spacing w:before="20" w:after="20"/>
+              <w:jc w:val="left"/>
+            </w:pPr>
+            <w:r/>
+            <w:r>
+              <w:rPr>
+                <w:b w:val="0"/>
+                <w:sz w:val="18"/>
+              </w:rPr>
+              <w:t>KT SA</w:t>
+            </w:r>
+          </w:p>
+        </w:tc>
+        <w:tc>
+          <w:tcPr>
+            <w:tcW w:type="dxa" w:w="907"/>
+          </w:tcPr>
+          <w:p>
+            <w:pPr>
+              <w:spacing w:before="20" w:after="20"/>
+              <w:jc w:val="center"/>
+            </w:pPr>
+            <w:r/>
+            <w:r>
+              <w:rPr>
+                <w:b w:val="0"/>
+                <w:sz w:val="18"/>
+              </w:rPr>
+              <w:t>173°</w:t>
+            </w:r>
+          </w:p>
+        </w:tc>
+        <w:tc>
+          <w:tcPr>
+            <w:tcW w:type="dxa" w:w="1247"/>
+          </w:tcPr>
+          <w:p>
+            <w:pPr>
+              <w:spacing w:before="20" w:after="20"/>
+              <w:jc w:val="center"/>
+            </w:pPr>
+            <w:r/>
+            <w:r>
+              <w:rPr>
+                <w:b w:val="0"/>
+                <w:sz w:val="18"/>
+              </w:rPr>
+              <w:t>348 m</w:t>
+            </w:r>
+          </w:p>
+        </w:tc>
+        <w:tc>
+          <w:tcPr>
+            <w:tcW w:type="dxa" w:w="1587"/>
+          </w:tcPr>
+          <w:p>
+            <w:pPr>
+              <w:spacing w:before="20" w:after="20"/>
+              <w:jc w:val="left"/>
+            </w:pPr>
+            <w:r/>
+            <w:r>
+              <w:rPr>
+                <w:b w:val="0"/>
+                <w:sz w:val="18"/>
+              </w:rPr>
+              <w:t>KT SZA</w:t>
+            </w:r>
+          </w:p>
+        </w:tc>
+        <w:tc>
+          <w:tcPr>
+            <w:tcW w:type="dxa" w:w="4480"/>
+          </w:tcPr>
+          <w:p>
+            <w:pPr>
+              <w:spacing w:before="20" w:after="20"/>
+              <w:jc w:val="left"/>
+            </w:pPr>
+            <w:r/>
+            <w:r>
+              <w:rPr>
+                <w:b w:val="0"/>
+                <w:sz w:val="18"/>
+              </w:rPr>
+              <w:t>Raskrižje planinske staze i ceste</w:t>
+            </w:r>
+          </w:p>
+        </w:tc>
+      </w:tr>
+      <w:tr>
+        <w:tc>
+          <w:tcPr>
+            <w:tcW w:type="dxa" w:w="397"/>
+          </w:tcPr>
+          <w:p>
+            <w:pPr>
+              <w:spacing w:before="20" w:after="20"/>
+              <w:jc w:val="center"/>
+            </w:pPr>
+            <w:r/>
+            <w:r>
+              <w:rPr>
+                <w:b w:val="0"/>
+                <w:sz w:val="18"/>
+              </w:rPr>
+              <w:t>4</w:t>
+            </w:r>
+          </w:p>
+        </w:tc>
+        <w:tc>
+          <w:tcPr>
+            <w:tcW w:type="dxa" w:w="1587"/>
+          </w:tcPr>
+          <w:p>
+            <w:pPr>
+              <w:spacing w:before="20" w:after="20"/>
+              <w:jc w:val="left"/>
+            </w:pPr>
+            <w:r/>
+            <w:r>
+              <w:rPr>
+                <w:b w:val="0"/>
+                <w:sz w:val="18"/>
+              </w:rPr>
+              <w:t>KT SZA</w:t>
+            </w:r>
+          </w:p>
+        </w:tc>
+        <w:tc>
+          <w:tcPr>
+            <w:tcW w:type="dxa" w:w="907"/>
+          </w:tcPr>
+          <w:p>
+            <w:pPr>
+              <w:spacing w:before="20" w:after="20"/>
+              <w:jc w:val="center"/>
+            </w:pPr>
+            <w:r/>
+            <w:r>
+              <w:rPr>
+                <w:b w:val="0"/>
+                <w:sz w:val="18"/>
+              </w:rPr>
+              <w:t>187°</w:t>
+            </w:r>
+          </w:p>
+        </w:tc>
+        <w:tc>
+          <w:tcPr>
+            <w:tcW w:type="dxa" w:w="1247"/>
+          </w:tcPr>
+          <w:p>
+            <w:pPr>
+              <w:spacing w:before="20" w:after="20"/>
+              <w:jc w:val="center"/>
+            </w:pPr>
+            <w:r/>
+            <w:r>
+              <w:rPr>
+                <w:b w:val="0"/>
+                <w:sz w:val="18"/>
+              </w:rPr>
+              <w:t>412 m</w:t>
+            </w:r>
+          </w:p>
+        </w:tc>
+        <w:tc>
+          <w:tcPr>
+            <w:tcW w:type="dxa" w:w="1587"/>
+          </w:tcPr>
+          <w:p>
+            <w:pPr>
+              <w:spacing w:before="20" w:after="20"/>
+              <w:jc w:val="left"/>
+            </w:pPr>
+            <w:r/>
+            <w:r>
+              <w:rPr>
+                <w:b w:val="0"/>
+                <w:sz w:val="18"/>
+              </w:rPr>
+              <w:t>KT JZA</w:t>
+            </w:r>
+          </w:p>
+        </w:tc>
+        <w:tc>
+          <w:tcPr>
+            <w:tcW w:type="dxa" w:w="4480"/>
+          </w:tcPr>
+          <w:p>
+            <w:pPr>
+              <w:spacing w:before="20" w:after="20"/>
+              <w:jc w:val="left"/>
+            </w:pPr>
+            <w:r/>
+            <w:r>
+              <w:rPr>
+                <w:b w:val="0"/>
+                <w:sz w:val="18"/>
+              </w:rPr>
+              <w:t>Raskrižje planinske staze i potoka</w:t>
+            </w:r>
+          </w:p>
+        </w:tc>
+      </w:tr>
+      <w:tr>
+        <w:tc>
+          <w:tcPr>
+            <w:tcW w:type="dxa" w:w="397"/>
+          </w:tcPr>
+          <w:p>
+            <w:pPr>
+              <w:spacing w:before="20" w:after="20"/>
+              <w:jc w:val="center"/>
+            </w:pPr>
+            <w:r/>
+            <w:r>
+              <w:rPr>
+                <w:b w:val="0"/>
+                <w:sz w:val="18"/>
+              </w:rPr>
+              <w:t>5</w:t>
+            </w:r>
+          </w:p>
+        </w:tc>
+        <w:tc>
+          <w:tcPr>
+            <w:tcW w:type="dxa" w:w="1587"/>
+          </w:tcPr>
+          <w:p>
+            <w:pPr>
+              <w:spacing w:before="20" w:after="20"/>
+              <w:jc w:val="left"/>
+            </w:pPr>
+            <w:r/>
+            <w:r>
+              <w:rPr>
+                <w:b w:val="0"/>
+                <w:sz w:val="18"/>
+              </w:rPr>
+              <w:t>KT JZA</w:t>
+            </w:r>
+          </w:p>
+        </w:tc>
+        <w:tc>
+          <w:tcPr>
+            <w:tcW w:type="dxa" w:w="907"/>
+          </w:tcPr>
+          <w:p>
+            <w:pPr>
+              <w:spacing w:before="20" w:after="20"/>
+              <w:jc w:val="center"/>
+            </w:pPr>
+            <w:r/>
+            <w:r>
+              <w:rPr>
+                <w:b w:val="0"/>
+                <w:sz w:val="18"/>
+              </w:rPr>
+              <w:t>130°</w:t>
+            </w:r>
+          </w:p>
+        </w:tc>
+        <w:tc>
+          <w:tcPr>
+            <w:tcW w:type="dxa" w:w="1247"/>
+          </w:tcPr>
+          <w:p>
+            <w:pPr>
+              <w:spacing w:before="20" w:after="20"/>
+              <w:jc w:val="center"/>
+            </w:pPr>
+            <w:r/>
+            <w:r>
+              <w:rPr>
+                <w:b w:val="0"/>
+                <w:sz w:val="18"/>
+              </w:rPr>
+              <w:t>611 m</w:t>
+            </w:r>
+          </w:p>
+        </w:tc>
+        <w:tc>
+          <w:tcPr>
+            <w:tcW w:type="dxa" w:w="1587"/>
+          </w:tcPr>
+          <w:p>
+            <w:pPr>
+              <w:spacing w:before="20" w:after="20"/>
+              <w:jc w:val="left"/>
+            </w:pPr>
+            <w:r/>
+            <w:r>
+              <w:rPr>
+                <w:b w:val="0"/>
+                <w:sz w:val="18"/>
+              </w:rPr>
+              <w:t>DOM</w:t>
+            </w:r>
+          </w:p>
+        </w:tc>
+        <w:tc>
+          <w:tcPr>
+            <w:tcW w:type="dxa" w:w="4480"/>
+          </w:tcPr>
+          <w:p>
+            <w:pPr>
+              <w:spacing w:before="20" w:after="20"/>
+              <w:jc w:val="left"/>
+            </w:pPr>
+            <w:r/>
+            <w:r>
+              <w:rPr>
+                <w:b w:val="0"/>
+                <w:sz w:val="18"/>
+              </w:rPr>
+              <w:t>Planinarski dom</w:t>
+            </w:r>
+          </w:p>
+        </w:tc>
+      </w:tr>
+    </w:tbl>
+    <w:p>
+      <w:pPr>
+        <w:spacing w:before="0" w:after="0"/>
+      </w:pPr>
+      <w:r>
+        <w:br w:type="page"/>
+      </w:r>
+    </w:p>
+    <w:tbl>
+      <w:tblPr>
+        <w:tblW w:type="auto" w:w="0"/>
+        <w:jc w:val="center"/>
+        <w:tblLook w:firstColumn="1" w:firstRow="1" w:lastColumn="0" w:lastRow="0" w:noHBand="0" w:noVBand="1" w:val="04A0"/>
+      </w:tblPr>
+      <w:tblGrid>
+        <w:gridCol w:w="2041"/>
+        <w:gridCol w:w="2041"/>
+        <w:gridCol w:w="2041"/>
+        <w:gridCol w:w="2041"/>
+        <w:gridCol w:w="2041"/>
+      </w:tblGrid>
+      <w:tr>
+        <w:trPr>
+          <w:trHeight w:val="1814" w:hRule="exact"/>
+        </w:trPr>
+        <w:tc>
+          <w:tcPr>
+            <w:tcW w:type="dxa" w:w="2041"/>
+            <w:tcBorders>
+              <w:top w:val="single" w:sz="18" w:color="000000"/>
+              <w:left w:val="single" w:sz="18" w:color="000000"/>
+              <w:bottom w:val="single" w:sz="18" w:color="000000"/>
+              <w:right w:val="single" w:sz="18" w:color="000000"/>
+            </w:tcBorders>
+          </w:tcPr>
+          <w:p/>
+        </w:tc>
+        <w:tc>
+          <w:tcPr>
+            <w:tcW w:type="dxa" w:w="2041"/>
+            <w:tcBorders>
+              <w:top w:val="single" w:sz="18" w:color="000000"/>
+              <w:left w:val="single" w:sz="18" w:color="000000"/>
+              <w:bottom w:val="single" w:sz="18" w:color="000000"/>
+              <w:right w:val="single" w:sz="18" w:color="000000"/>
+            </w:tcBorders>
+          </w:tcPr>
+          <w:p/>
+        </w:tc>
+        <w:tc>
+          <w:tcPr>
+            <w:tcW w:type="dxa" w:w="2041"/>
+            <w:tcBorders>
+              <w:top w:val="single" w:sz="18" w:color="000000"/>
+              <w:left w:val="single" w:sz="18" w:color="000000"/>
+              <w:bottom w:val="single" w:sz="18" w:color="000000"/>
+              <w:right w:val="single" w:sz="18" w:color="000000"/>
+            </w:tcBorders>
+          </w:tcPr>
+          <w:p/>
+        </w:tc>
+        <w:tc>
+          <w:tcPr>
+            <w:tcW w:type="dxa" w:w="2041"/>
+            <w:tcBorders>
+              <w:top w:val="single" w:sz="18" w:color="000000"/>
+              <w:left w:val="single" w:sz="18" w:color="000000"/>
+              <w:bottom w:val="single" w:sz="18" w:color="000000"/>
+              <w:right w:val="single" w:sz="18" w:color="000000"/>
+            </w:tcBorders>
+          </w:tcPr>
+          <w:p/>
+        </w:tc>
+        <w:tc>
+          <w:tcPr>
+            <w:tcW w:type="dxa" w:w="2041"/>
+            <w:tcBorders>
+              <w:top w:val="single" w:sz="18" w:color="000000"/>
+              <w:left w:val="single" w:sz="18" w:color="000000"/>
+              <w:bottom w:val="single" w:sz="18" w:color="000000"/>
+              <w:right w:val="single" w:sz="18" w:color="000000"/>
+            </w:tcBorders>
+          </w:tcPr>
+          <w:p/>
+        </w:tc>
+      </w:tr>
+      <w:tr>
+        <w:trPr>
+          <w:trHeight w:val="397" w:hRule="exact"/>
+        </w:trPr>
+        <w:tc>
+          <w:tcPr>
+            <w:tcW w:type="dxa" w:w="2041"/>
+            <w:tcBorders>
+              <w:top w:val="single" w:sz="12" w:color="000000"/>
+              <w:left w:val="single" w:sz="12" w:color="000000"/>
+              <w:bottom w:val="single" w:sz="12" w:color="000000"/>
+              <w:right w:val="single" w:sz="12" w:color="000000"/>
+            </w:tcBorders>
+            <w:shd w:val="clear" w:color="auto" w:fill="DDDDDD"/>
+          </w:tcPr>
+          <w:p>
+            <w:pPr>
+              <w:spacing w:before="20" w:after="20"/>
+              <w:jc w:val="center"/>
+            </w:pPr>
+            <w:r/>
+            <w:r>
+              <w:rPr>
+                <w:b/>
+                <w:sz w:val="16"/>
+              </w:rPr>
+              <w:t>DOM</w:t>
+            </w:r>
+          </w:p>
+        </w:tc>
+        <w:tc>
+          <w:tcPr>
+            <w:tcW w:type="dxa" w:w="2041"/>
+            <w:tcBorders>
+              <w:top w:val="single" w:sz="12" w:color="000000"/>
+              <w:left w:val="single" w:sz="12" w:color="000000"/>
+              <w:bottom w:val="single" w:sz="12" w:color="000000"/>
+              <w:right w:val="single" w:sz="12" w:color="000000"/>
+            </w:tcBorders>
+            <w:shd w:val="clear" w:color="auto" w:fill="DDDDDD"/>
+          </w:tcPr>
+          <w:p>
+            <w:pPr>
+              <w:spacing w:before="20" w:after="20"/>
+              <w:jc w:val="center"/>
+            </w:pPr>
+            <w:r/>
+            <w:r>
+              <w:rPr>
+                <w:b/>
+                <w:sz w:val="16"/>
+              </w:rPr>
+              <w:t>KT JIA</w:t>
+            </w:r>
+          </w:p>
+        </w:tc>
+        <w:tc>
+          <w:tcPr>
+            <w:tcW w:type="dxa" w:w="2041"/>
+            <w:tcBorders>
+              <w:top w:val="single" w:sz="12" w:color="000000"/>
+              <w:left w:val="single" w:sz="12" w:color="000000"/>
+              <w:bottom w:val="single" w:sz="12" w:color="000000"/>
+              <w:right w:val="single" w:sz="12" w:color="000000"/>
+            </w:tcBorders>
+            <w:shd w:val="clear" w:color="auto" w:fill="DDDDDD"/>
+          </w:tcPr>
+          <w:p>
+            <w:pPr>
+              <w:spacing w:before="20" w:after="20"/>
+              <w:jc w:val="center"/>
+            </w:pPr>
+            <w:r/>
+            <w:r>
+              <w:rPr>
+                <w:b/>
+                <w:sz w:val="16"/>
+              </w:rPr>
+              <w:t>KT SIA</w:t>
+            </w:r>
+          </w:p>
+        </w:tc>
+        <w:tc>
+          <w:tcPr>
+            <w:tcW w:type="dxa" w:w="2041"/>
+            <w:tcBorders>
+              <w:top w:val="single" w:sz="12" w:color="000000"/>
+              <w:left w:val="single" w:sz="12" w:color="000000"/>
+              <w:bottom w:val="single" w:sz="12" w:color="000000"/>
+              <w:right w:val="single" w:sz="12" w:color="000000"/>
+            </w:tcBorders>
+            <w:shd w:val="clear" w:color="auto" w:fill="DDDDDD"/>
+          </w:tcPr>
+          <w:p>
+            <w:pPr>
+              <w:spacing w:before="20" w:after="20"/>
+              <w:jc w:val="center"/>
+            </w:pPr>
+            <w:r/>
+            <w:r>
+              <w:rPr>
+                <w:b/>
+                <w:sz w:val="16"/>
+              </w:rPr>
+              <w:t>KT SZA</w:t>
+            </w:r>
+          </w:p>
+        </w:tc>
+        <w:tc>
+          <w:tcPr>
+            <w:tcW w:type="dxa" w:w="2041"/>
+            <w:tcBorders>
+              <w:top w:val="single" w:sz="12" w:color="000000"/>
+              <w:left w:val="single" w:sz="12" w:color="000000"/>
+              <w:bottom w:val="single" w:sz="12" w:color="000000"/>
+              <w:right w:val="single" w:sz="12" w:color="000000"/>
+            </w:tcBorders>
+            <w:shd w:val="clear" w:color="auto" w:fill="DDDDDD"/>
+          </w:tcPr>
+          <w:p>
+            <w:pPr>
+              <w:spacing w:before="20" w:after="20"/>
+              <w:jc w:val="center"/>
+            </w:pPr>
+            <w:r/>
+            <w:r>
+              <w:rPr>
+                <w:b/>
+                <w:sz w:val="16"/>
+              </w:rPr>
+              <w:t>KT ZA</w:t>
+            </w:r>
+          </w:p>
+        </w:tc>
+      </w:tr>
+    </w:tbl>
+    <w:p>
+      <w:pPr>
+        <w:spacing w:before="160" w:after="0"/>
+        <w:jc w:val="center"/>
+      </w:pPr>
+      <w:r>
+        <w:rPr>
+          <w:b w:val="0"/>
+          <w:sz w:val="24"/>
+        </w:rPr>
+        <w:t>Vježba orijentacije — Okić</w:t>
+      </w:r>
+    </w:p>
+    <w:p>
+      <w:pPr>
+        <w:spacing w:before="40" w:after="120"/>
+        <w:jc w:val="center"/>
+      </w:pPr>
+      <w:r>
+        <w:rPr>
+          <w:b/>
+          <w:sz w:val="30"/>
+        </w:rPr>
+        <w:t>Grupa 7</w:t>
+      </w:r>
+    </w:p>
+    <w:p>
+      <w:pPr>
+        <w:spacing w:before="0" w:after="40"/>
+        <w:jc w:val="left"/>
+      </w:pPr>
+      <w:r>
+        <w:rPr>
+          <w:b/>
+          <w:sz w:val="18"/>
+        </w:rPr>
+        <w:t>Upute:</w:t>
+      </w:r>
+    </w:p>
+    <w:p>
+      <w:pPr>
+        <w:pStyle w:val="ListBullet"/>
+        <w:spacing w:before="0" w:after="0"/>
+      </w:pPr>
+      <w:r>
+        <w:rPr>
+          <w:sz w:val="18"/>
+        </w:rPr>
+        <w:t>Staza kreće i završava na DOM-u (planinarskom domu).</w:t>
+      </w:r>
+    </w:p>
+    <w:p>
+      <w:pPr>
+        <w:pStyle w:val="ListBullet"/>
+        <w:spacing w:before="0" w:after="0"/>
+      </w:pPr>
+      <w:r>
+        <w:rPr>
+          <w:sz w:val="18"/>
+        </w:rPr>
+        <w:t>Koristeći tablicu segmenata i kompas, ucrtaj sve kontrolne točke na karti. Voditelj vježbe mora potvrditi položaj svih točaka prije polaska na teren.</w:t>
+      </w:r>
+    </w:p>
+    <w:p>
+      <w:pPr>
+        <w:pStyle w:val="ListBullet"/>
+        <w:spacing w:before="0" w:after="0"/>
+      </w:pPr>
+      <w:r>
+        <w:rPr>
+          <w:sz w:val="18"/>
+        </w:rPr>
+        <w:t>Na svakom KT-u dokaži prolazak bušenjem kartona bušačem koji se nalazi na toj točki.</w:t>
+      </w:r>
+    </w:p>
+    <w:p>
+      <w:pPr>
+        <w:pStyle w:val="ListBullet"/>
+        <w:spacing w:before="0" w:after="0"/>
+      </w:pPr>
+      <w:r>
+        <w:rPr>
+          <w:sz w:val="18"/>
+        </w:rPr>
+        <w:t>Svaki puta kada se buši karton, druga osoba iz grupe SMS-om dojavuje voditelju vježbe trenutne GPS koordinate. Koordinate su dostupne u navigacijskoj aplikaciji na mobitelu.</w:t>
+      </w:r>
+    </w:p>
+    <w:p>
+      <w:pPr>
+        <w:pStyle w:val="ListBullet"/>
+        <w:spacing w:before="0" w:after="0"/>
+      </w:pPr>
+      <w:r>
+        <w:rPr>
+          <w:sz w:val="18"/>
+        </w:rPr>
+        <w:t>Na terenu je dopušteno koristiti elektroničku navigaciju (mobitel, GPS aplikacija).</w:t>
+      </w:r>
+    </w:p>
+    <w:p>
+      <w:pPr>
+        <w:pStyle w:val="ListBullet"/>
+        <w:spacing w:before="0" w:after="0"/>
+      </w:pPr>
+      <w:r>
+        <w:rPr>
+          <w:sz w:val="18"/>
+        </w:rPr>
+        <w:t>Kretati se smije samo po označenim planinarskim stazama, cestama i šumskim putovima.</w:t>
+      </w:r>
+    </w:p>
+    <w:p>
+      <w:pPr>
+        <w:spacing w:before="160" w:after="40"/>
+        <w:jc w:val="left"/>
+      </w:pPr>
+      <w:r>
+        <w:rPr>
+          <w:b/>
+          <w:sz w:val="18"/>
+        </w:rPr>
+        <w:t>Segmenti rute:</w:t>
+      </w:r>
+    </w:p>
+    <w:tbl>
+      <w:tblPr>
+        <w:tblStyle w:val="TableGrid"/>
+        <w:tblW w:type="auto" w:w="0"/>
+        <w:jc w:val="center"/>
+        <w:tblLook w:firstColumn="1" w:firstRow="1" w:lastColumn="0" w:lastRow="0" w:noHBand="0" w:noVBand="1" w:val="04A0"/>
+      </w:tblPr>
+      <w:tblGrid>
+        <w:gridCol w:w="1701"/>
+        <w:gridCol w:w="1701"/>
+        <w:gridCol w:w="1701"/>
+        <w:gridCol w:w="1701"/>
+        <w:gridCol w:w="1701"/>
+        <w:gridCol w:w="1701"/>
+      </w:tblGrid>
+      <w:tr>
+        <w:tc>
+          <w:tcPr>
+            <w:tcW w:type="dxa" w:w="397"/>
+            <w:shd w:val="clear" w:color="auto" w:fill="BBBBBB"/>
+          </w:tcPr>
+          <w:p>
+            <w:pPr>
+              <w:spacing w:before="20" w:after="20"/>
+              <w:jc w:val="center"/>
+            </w:pPr>
+            <w:r/>
+            <w:r>
+              <w:rPr>
+                <w:b/>
+                <w:sz w:val="18"/>
+              </w:rPr>
+              <w:t>#</w:t>
+            </w:r>
+          </w:p>
+        </w:tc>
+        <w:tc>
+          <w:tcPr>
+            <w:tcW w:type="dxa" w:w="1587"/>
+            <w:shd w:val="clear" w:color="auto" w:fill="BBBBBB"/>
+          </w:tcPr>
+          <w:p>
+            <w:pPr>
+              <w:spacing w:before="20" w:after="20"/>
+              <w:jc w:val="center"/>
+            </w:pPr>
+            <w:r/>
+            <w:r>
+              <w:rPr>
+                <w:b/>
+                <w:sz w:val="18"/>
+              </w:rPr>
+              <w:t>Od</w:t>
+            </w:r>
+          </w:p>
+        </w:tc>
+        <w:tc>
+          <w:tcPr>
+            <w:tcW w:type="dxa" w:w="907"/>
+            <w:shd w:val="clear" w:color="auto" w:fill="BBBBBB"/>
+          </w:tcPr>
+          <w:p>
+            <w:pPr>
+              <w:spacing w:before="20" w:after="20"/>
+              <w:jc w:val="center"/>
+            </w:pPr>
+            <w:r/>
+            <w:r>
+              <w:rPr>
+                <w:b/>
+                <w:sz w:val="18"/>
+              </w:rPr>
+              <w:t>Azimut</w:t>
+            </w:r>
+          </w:p>
+        </w:tc>
+        <w:tc>
+          <w:tcPr>
+            <w:tcW w:type="dxa" w:w="1247"/>
+            <w:shd w:val="clear" w:color="auto" w:fill="BBBBBB"/>
+          </w:tcPr>
+          <w:p>
+            <w:pPr>
+              <w:spacing w:before="20" w:after="20"/>
+              <w:jc w:val="center"/>
+            </w:pPr>
+            <w:r/>
+            <w:r>
+              <w:rPr>
+                <w:b/>
+                <w:sz w:val="18"/>
+              </w:rPr>
+              <w:t>Udaljenost</w:t>
+            </w:r>
+          </w:p>
+        </w:tc>
+        <w:tc>
+          <w:tcPr>
+            <w:tcW w:type="dxa" w:w="1587"/>
+            <w:shd w:val="clear" w:color="auto" w:fill="BBBBBB"/>
+          </w:tcPr>
+          <w:p>
+            <w:pPr>
+              <w:spacing w:before="20" w:after="20"/>
+              <w:jc w:val="center"/>
+            </w:pPr>
+            <w:r/>
+            <w:r>
+              <w:rPr>
+                <w:b/>
+                <w:sz w:val="18"/>
+              </w:rPr>
+              <w:t>Do</w:t>
+            </w:r>
+          </w:p>
+        </w:tc>
+        <w:tc>
+          <w:tcPr>
+            <w:tcW w:type="dxa" w:w="4480"/>
+            <w:shd w:val="clear" w:color="auto" w:fill="BBBBBB"/>
+          </w:tcPr>
+          <w:p>
+            <w:pPr>
+              <w:spacing w:before="20" w:after="20"/>
+              <w:jc w:val="center"/>
+            </w:pPr>
+            <w:r/>
+            <w:r>
+              <w:rPr>
+                <w:b/>
+                <w:sz w:val="18"/>
+              </w:rPr>
+              <w:t>Opis odredišne KT</w:t>
+            </w:r>
+          </w:p>
+        </w:tc>
+      </w:tr>
+      <w:tr>
+        <w:tc>
+          <w:tcPr>
+            <w:tcW w:type="dxa" w:w="397"/>
+          </w:tcPr>
+          <w:p>
+            <w:pPr>
+              <w:spacing w:before="20" w:after="20"/>
+              <w:jc w:val="center"/>
+            </w:pPr>
+            <w:r/>
+            <w:r>
+              <w:rPr>
+                <w:b w:val="0"/>
+                <w:sz w:val="18"/>
+              </w:rPr>
+              <w:t>1</w:t>
+            </w:r>
+          </w:p>
+        </w:tc>
+        <w:tc>
+          <w:tcPr>
+            <w:tcW w:type="dxa" w:w="1587"/>
+          </w:tcPr>
+          <w:p>
+            <w:pPr>
+              <w:spacing w:before="20" w:after="20"/>
+              <w:jc w:val="left"/>
+            </w:pPr>
+            <w:r/>
+            <w:r>
+              <w:rPr>
+                <w:b w:val="0"/>
+                <w:sz w:val="18"/>
+              </w:rPr>
+              <w:t>DOM</w:t>
+            </w:r>
+          </w:p>
+        </w:tc>
+        <w:tc>
+          <w:tcPr>
+            <w:tcW w:type="dxa" w:w="907"/>
+          </w:tcPr>
+          <w:p>
+            <w:pPr>
+              <w:spacing w:before="20" w:after="20"/>
+              <w:jc w:val="center"/>
+            </w:pPr>
+            <w:r/>
+            <w:r>
+              <w:rPr>
+                <w:b w:val="0"/>
+                <w:sz w:val="18"/>
+              </w:rPr>
+              <w:t>358°</w:t>
+            </w:r>
+          </w:p>
+        </w:tc>
+        <w:tc>
+          <w:tcPr>
+            <w:tcW w:type="dxa" w:w="1247"/>
+          </w:tcPr>
+          <w:p>
+            <w:pPr>
+              <w:spacing w:before="20" w:after="20"/>
+              <w:jc w:val="center"/>
+            </w:pPr>
+            <w:r/>
+            <w:r>
+              <w:rPr>
+                <w:b w:val="0"/>
+                <w:sz w:val="18"/>
+              </w:rPr>
+              <w:t>500 m</w:t>
+            </w:r>
+          </w:p>
+        </w:tc>
+        <w:tc>
+          <w:tcPr>
+            <w:tcW w:type="dxa" w:w="1587"/>
+          </w:tcPr>
+          <w:p>
+            <w:pPr>
+              <w:spacing w:before="20" w:after="20"/>
+              <w:jc w:val="left"/>
+            </w:pPr>
+            <w:r/>
+            <w:r>
+              <w:rPr>
+                <w:b w:val="0"/>
+                <w:sz w:val="18"/>
+              </w:rPr>
+              <w:t>KT JIA</w:t>
+            </w:r>
+          </w:p>
+        </w:tc>
+        <w:tc>
+          <w:tcPr>
+            <w:tcW w:type="dxa" w:w="4480"/>
+          </w:tcPr>
+          <w:p>
+            <w:pPr>
+              <w:spacing w:before="20" w:after="20"/>
+              <w:jc w:val="left"/>
+            </w:pPr>
+            <w:r/>
+            <w:r>
+              <w:rPr>
+                <w:b w:val="0"/>
+                <w:sz w:val="18"/>
+              </w:rPr>
+              <w:t>Prelazak ceste preko potoka</w:t>
+            </w:r>
+          </w:p>
+        </w:tc>
+      </w:tr>
+      <w:tr>
+        <w:tc>
+          <w:tcPr>
+            <w:tcW w:type="dxa" w:w="397"/>
+          </w:tcPr>
+          <w:p>
+            <w:pPr>
+              <w:spacing w:before="20" w:after="20"/>
+              <w:jc w:val="center"/>
+            </w:pPr>
+            <w:r/>
+            <w:r>
+              <w:rPr>
+                <w:b w:val="0"/>
+                <w:sz w:val="18"/>
+              </w:rPr>
+              <w:t>2</w:t>
+            </w:r>
+          </w:p>
+        </w:tc>
+        <w:tc>
+          <w:tcPr>
+            <w:tcW w:type="dxa" w:w="1587"/>
+          </w:tcPr>
+          <w:p>
+            <w:pPr>
+              <w:spacing w:before="20" w:after="20"/>
+              <w:jc w:val="left"/>
+            </w:pPr>
+            <w:r/>
+            <w:r>
+              <w:rPr>
+                <w:b w:val="0"/>
+                <w:sz w:val="18"/>
+              </w:rPr>
+              <w:t>KT JIA</w:t>
+            </w:r>
+          </w:p>
+        </w:tc>
+        <w:tc>
+          <w:tcPr>
+            <w:tcW w:type="dxa" w:w="907"/>
+          </w:tcPr>
+          <w:p>
+            <w:pPr>
+              <w:spacing w:before="20" w:after="20"/>
+              <w:jc w:val="center"/>
+            </w:pPr>
+            <w:r/>
+            <w:r>
+              <w:rPr>
+                <w:b w:val="0"/>
+                <w:sz w:val="18"/>
+              </w:rPr>
+              <w:t>350°</w:t>
+            </w:r>
+          </w:p>
+        </w:tc>
+        <w:tc>
+          <w:tcPr>
+            <w:tcW w:type="dxa" w:w="1247"/>
+          </w:tcPr>
+          <w:p>
+            <w:pPr>
+              <w:spacing w:before="20" w:after="20"/>
+              <w:jc w:val="center"/>
+            </w:pPr>
+            <w:r/>
+            <w:r>
+              <w:rPr>
+                <w:b w:val="0"/>
+                <w:sz w:val="18"/>
+              </w:rPr>
+              <w:t>487 m</w:t>
+            </w:r>
+          </w:p>
+        </w:tc>
+        <w:tc>
+          <w:tcPr>
+            <w:tcW w:type="dxa" w:w="1587"/>
+          </w:tcPr>
+          <w:p>
+            <w:pPr>
+              <w:spacing w:before="20" w:after="20"/>
+              <w:jc w:val="left"/>
+            </w:pPr>
+            <w:r/>
+            <w:r>
+              <w:rPr>
+                <w:b w:val="0"/>
+                <w:sz w:val="18"/>
+              </w:rPr>
+              <w:t>KT SIA</w:t>
+            </w:r>
+          </w:p>
+        </w:tc>
+        <w:tc>
+          <w:tcPr>
+            <w:tcW w:type="dxa" w:w="4480"/>
+          </w:tcPr>
+          <w:p>
+            <w:pPr>
+              <w:spacing w:before="20" w:after="20"/>
+              <w:jc w:val="left"/>
+            </w:pPr>
+            <w:r/>
+            <w:r>
+              <w:rPr>
+                <w:b w:val="0"/>
+                <w:sz w:val="18"/>
+              </w:rPr>
+              <w:t>Raskrižje ceste i puta</w:t>
+            </w:r>
+          </w:p>
+        </w:tc>
+      </w:tr>
+      <w:tr>
+        <w:tc>
+          <w:tcPr>
+            <w:tcW w:type="dxa" w:w="397"/>
+          </w:tcPr>
+          <w:p>
+            <w:pPr>
+              <w:spacing w:before="20" w:after="20"/>
+              <w:jc w:val="center"/>
+            </w:pPr>
+            <w:r/>
+            <w:r>
+              <w:rPr>
+                <w:b w:val="0"/>
+                <w:sz w:val="18"/>
+              </w:rPr>
+              <w:t>3</w:t>
+            </w:r>
+          </w:p>
+        </w:tc>
+        <w:tc>
+          <w:tcPr>
+            <w:tcW w:type="dxa" w:w="1587"/>
+          </w:tcPr>
+          <w:p>
+            <w:pPr>
+              <w:spacing w:before="20" w:after="20"/>
+              <w:jc w:val="left"/>
+            </w:pPr>
+            <w:r/>
+            <w:r>
+              <w:rPr>
+                <w:b w:val="0"/>
+                <w:sz w:val="18"/>
+              </w:rPr>
+              <w:t>KT SIA</w:t>
+            </w:r>
+          </w:p>
+        </w:tc>
+        <w:tc>
+          <w:tcPr>
+            <w:tcW w:type="dxa" w:w="907"/>
+          </w:tcPr>
+          <w:p>
+            <w:pPr>
+              <w:spacing w:before="20" w:after="20"/>
+              <w:jc w:val="center"/>
+            </w:pPr>
+            <w:r/>
+            <w:r>
+              <w:rPr>
+                <w:b w:val="0"/>
+                <w:sz w:val="18"/>
+              </w:rPr>
+              <w:t>240°</w:t>
+            </w:r>
+          </w:p>
+        </w:tc>
+        <w:tc>
+          <w:tcPr>
+            <w:tcW w:type="dxa" w:w="1247"/>
+          </w:tcPr>
+          <w:p>
+            <w:pPr>
+              <w:spacing w:before="20" w:after="20"/>
+              <w:jc w:val="center"/>
+            </w:pPr>
+            <w:r/>
+            <w:r>
+              <w:rPr>
+                <w:b w:val="0"/>
+                <w:sz w:val="18"/>
+              </w:rPr>
+              <w:t>355 m</w:t>
+            </w:r>
+          </w:p>
+        </w:tc>
+        <w:tc>
+          <w:tcPr>
+            <w:tcW w:type="dxa" w:w="1587"/>
+          </w:tcPr>
+          <w:p>
+            <w:pPr>
+              <w:spacing w:before="20" w:after="20"/>
+              <w:jc w:val="left"/>
+            </w:pPr>
+            <w:r/>
+            <w:r>
+              <w:rPr>
+                <w:b w:val="0"/>
+                <w:sz w:val="18"/>
+              </w:rPr>
+              <w:t>KT SZA</w:t>
+            </w:r>
+          </w:p>
+        </w:tc>
+        <w:tc>
+          <w:tcPr>
+            <w:tcW w:type="dxa" w:w="4480"/>
+          </w:tcPr>
+          <w:p>
+            <w:pPr>
+              <w:spacing w:before="20" w:after="20"/>
+              <w:jc w:val="left"/>
+            </w:pPr>
+            <w:r/>
+            <w:r>
+              <w:rPr>
+                <w:b w:val="0"/>
+                <w:sz w:val="18"/>
+              </w:rPr>
+              <w:t>Raskrižje planinske staze i ceste</w:t>
+            </w:r>
+          </w:p>
+        </w:tc>
+      </w:tr>
+      <w:tr>
+        <w:tc>
+          <w:tcPr>
+            <w:tcW w:type="dxa" w:w="397"/>
+          </w:tcPr>
+          <w:p>
+            <w:pPr>
+              <w:spacing w:before="20" w:after="20"/>
+              <w:jc w:val="center"/>
+            </w:pPr>
+            <w:r/>
+            <w:r>
+              <w:rPr>
+                <w:b w:val="0"/>
+                <w:sz w:val="18"/>
+              </w:rPr>
+              <w:t>4</w:t>
+            </w:r>
+          </w:p>
+        </w:tc>
+        <w:tc>
+          <w:tcPr>
+            <w:tcW w:type="dxa" w:w="1587"/>
+          </w:tcPr>
+          <w:p>
+            <w:pPr>
+              <w:spacing w:before="20" w:after="20"/>
+              <w:jc w:val="left"/>
+            </w:pPr>
+            <w:r/>
+            <w:r>
+              <w:rPr>
+                <w:b w:val="0"/>
+                <w:sz w:val="18"/>
+              </w:rPr>
+              <w:t>KT SZA</w:t>
+            </w:r>
+          </w:p>
+        </w:tc>
+        <w:tc>
+          <w:tcPr>
+            <w:tcW w:type="dxa" w:w="907"/>
+          </w:tcPr>
+          <w:p>
+            <w:pPr>
+              <w:spacing w:before="20" w:after="20"/>
+              <w:jc w:val="center"/>
+            </w:pPr>
+            <w:r/>
+            <w:r>
+              <w:rPr>
+                <w:b w:val="0"/>
+                <w:sz w:val="18"/>
+              </w:rPr>
+              <w:t>236°</w:t>
+            </w:r>
+          </w:p>
+        </w:tc>
+        <w:tc>
+          <w:tcPr>
+            <w:tcW w:type="dxa" w:w="1247"/>
+          </w:tcPr>
+          <w:p>
+            <w:pPr>
+              <w:spacing w:before="20" w:after="20"/>
+              <w:jc w:val="center"/>
+            </w:pPr>
+            <w:r/>
+            <w:r>
+              <w:rPr>
+                <w:b w:val="0"/>
+                <w:sz w:val="18"/>
+              </w:rPr>
+              <w:t>519 m</w:t>
+            </w:r>
+          </w:p>
+        </w:tc>
+        <w:tc>
+          <w:tcPr>
+            <w:tcW w:type="dxa" w:w="1587"/>
+          </w:tcPr>
+          <w:p>
+            <w:pPr>
+              <w:spacing w:before="20" w:after="20"/>
+              <w:jc w:val="left"/>
+            </w:pPr>
+            <w:r/>
+            <w:r>
+              <w:rPr>
+                <w:b w:val="0"/>
+                <w:sz w:val="18"/>
+              </w:rPr>
+              <w:t>KT ZA</w:t>
+            </w:r>
+          </w:p>
+        </w:tc>
+        <w:tc>
+          <w:tcPr>
+            <w:tcW w:type="dxa" w:w="4480"/>
+          </w:tcPr>
+          <w:p>
+            <w:pPr>
+              <w:spacing w:before="20" w:after="20"/>
+              <w:jc w:val="left"/>
+            </w:pPr>
+            <w:r/>
+            <w:r>
+              <w:rPr>
+                <w:b w:val="0"/>
+                <w:sz w:val="18"/>
+              </w:rPr>
+              <w:t>Raskrižje puta i ceste</w:t>
+            </w:r>
+          </w:p>
+        </w:tc>
+      </w:tr>
+      <w:tr>
+        <w:tc>
+          <w:tcPr>
+            <w:tcW w:type="dxa" w:w="397"/>
+          </w:tcPr>
+          <w:p>
+            <w:pPr>
+              <w:spacing w:before="20" w:after="20"/>
+              <w:jc w:val="center"/>
+            </w:pPr>
+            <w:r/>
+            <w:r>
+              <w:rPr>
+                <w:b w:val="0"/>
+                <w:sz w:val="18"/>
+              </w:rPr>
+              <w:t>5</w:t>
+            </w:r>
+          </w:p>
+        </w:tc>
+        <w:tc>
+          <w:tcPr>
+            <w:tcW w:type="dxa" w:w="1587"/>
+          </w:tcPr>
+          <w:p>
+            <w:pPr>
+              <w:spacing w:before="20" w:after="20"/>
+              <w:jc w:val="left"/>
+            </w:pPr>
+            <w:r/>
+            <w:r>
+              <w:rPr>
+                <w:b w:val="0"/>
+                <w:sz w:val="18"/>
+              </w:rPr>
+              <w:t>KT ZA</w:t>
+            </w:r>
+          </w:p>
+        </w:tc>
+        <w:tc>
+          <w:tcPr>
+            <w:tcW w:type="dxa" w:w="907"/>
+          </w:tcPr>
+          <w:p>
+            <w:pPr>
+              <w:spacing w:before="20" w:after="20"/>
+              <w:jc w:val="center"/>
+            </w:pPr>
+            <w:r/>
+            <w:r>
+              <w:rPr>
+                <w:b w:val="0"/>
+                <w:sz w:val="18"/>
+              </w:rPr>
+              <w:t>121°</w:t>
+            </w:r>
+          </w:p>
+        </w:tc>
+        <w:tc>
+          <w:tcPr>
+            <w:tcW w:type="dxa" w:w="1247"/>
+          </w:tcPr>
+          <w:p>
+            <w:pPr>
+              <w:spacing w:before="20" w:after="20"/>
+              <w:jc w:val="center"/>
+            </w:pPr>
+            <w:r/>
+            <w:r>
+              <w:rPr>
+                <w:b w:val="0"/>
+                <w:sz w:val="18"/>
+              </w:rPr>
+              <w:t>989 m</w:t>
+            </w:r>
+          </w:p>
+        </w:tc>
+        <w:tc>
+          <w:tcPr>
+            <w:tcW w:type="dxa" w:w="1587"/>
+          </w:tcPr>
+          <w:p>
+            <w:pPr>
+              <w:spacing w:before="20" w:after="20"/>
+              <w:jc w:val="left"/>
+            </w:pPr>
+            <w:r/>
+            <w:r>
+              <w:rPr>
+                <w:b w:val="0"/>
+                <w:sz w:val="18"/>
+              </w:rPr>
+              <w:t>DOM</w:t>
+            </w:r>
+          </w:p>
+        </w:tc>
+        <w:tc>
+          <w:tcPr>
+            <w:tcW w:type="dxa" w:w="4480"/>
+          </w:tcPr>
+          <w:p>
+            <w:pPr>
+              <w:spacing w:before="20" w:after="20"/>
+              <w:jc w:val="left"/>
+            </w:pPr>
+            <w:r/>
+            <w:r>
+              <w:rPr>
+                <w:b w:val="0"/>
+                <w:sz w:val="18"/>
+              </w:rPr>
+              <w:t>Planinarski dom</w:t>
+            </w:r>
+          </w:p>
+        </w:tc>
+      </w:tr>
+    </w:tbl>
+    <w:p>
+      <w:pPr>
+        <w:spacing w:before="0" w:after="0"/>
+      </w:pPr>
+      <w:r>
+        <w:br w:type="page"/>
+      </w:r>
+    </w:p>
+    <w:tbl>
+      <w:tblPr>
+        <w:tblW w:type="auto" w:w="0"/>
+        <w:jc w:val="center"/>
+        <w:tblLook w:firstColumn="1" w:firstRow="1" w:lastColumn="0" w:lastRow="0" w:noHBand="0" w:noVBand="1" w:val="04A0"/>
+      </w:tblPr>
+      <w:tblGrid>
+        <w:gridCol w:w="2041"/>
+        <w:gridCol w:w="2041"/>
+        <w:gridCol w:w="2041"/>
+        <w:gridCol w:w="2041"/>
+        <w:gridCol w:w="2041"/>
+      </w:tblGrid>
+      <w:tr>
+        <w:trPr>
+          <w:trHeight w:val="1814" w:hRule="exact"/>
+        </w:trPr>
+        <w:tc>
+          <w:tcPr>
+            <w:tcW w:type="dxa" w:w="2041"/>
+            <w:tcBorders>
+              <w:top w:val="single" w:sz="18" w:color="000000"/>
+              <w:left w:val="single" w:sz="18" w:color="000000"/>
+              <w:bottom w:val="single" w:sz="18" w:color="000000"/>
+              <w:right w:val="single" w:sz="18" w:color="000000"/>
+            </w:tcBorders>
+          </w:tcPr>
+          <w:p/>
+        </w:tc>
+        <w:tc>
+          <w:tcPr>
+            <w:tcW w:type="dxa" w:w="2041"/>
+            <w:tcBorders>
+              <w:top w:val="single" w:sz="18" w:color="000000"/>
+              <w:left w:val="single" w:sz="18" w:color="000000"/>
+              <w:bottom w:val="single" w:sz="18" w:color="000000"/>
+              <w:right w:val="single" w:sz="18" w:color="000000"/>
+            </w:tcBorders>
+          </w:tcPr>
+          <w:p/>
+        </w:tc>
+        <w:tc>
+          <w:tcPr>
+            <w:tcW w:type="dxa" w:w="2041"/>
+            <w:tcBorders>
+              <w:top w:val="single" w:sz="18" w:color="000000"/>
+              <w:left w:val="single" w:sz="18" w:color="000000"/>
+              <w:bottom w:val="single" w:sz="18" w:color="000000"/>
+              <w:right w:val="single" w:sz="18" w:color="000000"/>
+            </w:tcBorders>
+          </w:tcPr>
+          <w:p/>
+        </w:tc>
+        <w:tc>
+          <w:tcPr>
+            <w:tcW w:type="dxa" w:w="2041"/>
+            <w:tcBorders>
+              <w:top w:val="single" w:sz="18" w:color="000000"/>
+              <w:left w:val="single" w:sz="18" w:color="000000"/>
+              <w:bottom w:val="single" w:sz="18" w:color="000000"/>
+              <w:right w:val="single" w:sz="18" w:color="000000"/>
+            </w:tcBorders>
+          </w:tcPr>
+          <w:p/>
+        </w:tc>
+        <w:tc>
+          <w:tcPr>
+            <w:tcW w:type="dxa" w:w="2041"/>
+            <w:tcBorders>
+              <w:top w:val="single" w:sz="18" w:color="000000"/>
+              <w:left w:val="single" w:sz="18" w:color="000000"/>
+              <w:bottom w:val="single" w:sz="18" w:color="000000"/>
+              <w:right w:val="single" w:sz="18" w:color="000000"/>
+            </w:tcBorders>
+          </w:tcPr>
+          <w:p/>
+        </w:tc>
+      </w:tr>
+      <w:tr>
+        <w:trPr>
+          <w:trHeight w:val="397" w:hRule="exact"/>
+        </w:trPr>
+        <w:tc>
+          <w:tcPr>
+            <w:tcW w:type="dxa" w:w="2041"/>
+            <w:tcBorders>
+              <w:top w:val="single" w:sz="12" w:color="000000"/>
+              <w:left w:val="single" w:sz="12" w:color="000000"/>
+              <w:bottom w:val="single" w:sz="12" w:color="000000"/>
+              <w:right w:val="single" w:sz="12" w:color="000000"/>
+            </w:tcBorders>
+            <w:shd w:val="clear" w:color="auto" w:fill="DDDDDD"/>
+          </w:tcPr>
+          <w:p>
+            <w:pPr>
+              <w:spacing w:before="20" w:after="20"/>
+              <w:jc w:val="center"/>
+            </w:pPr>
+            <w:r/>
+            <w:r>
+              <w:rPr>
+                <w:b/>
+                <w:sz w:val="16"/>
+              </w:rPr>
+              <w:t>DOM</w:t>
+            </w:r>
+          </w:p>
+        </w:tc>
+        <w:tc>
+          <w:tcPr>
+            <w:tcW w:type="dxa" w:w="2041"/>
+            <w:tcBorders>
+              <w:top w:val="single" w:sz="12" w:color="000000"/>
+              <w:left w:val="single" w:sz="12" w:color="000000"/>
+              <w:bottom w:val="single" w:sz="12" w:color="000000"/>
+              <w:right w:val="single" w:sz="12" w:color="000000"/>
+            </w:tcBorders>
+            <w:shd w:val="clear" w:color="auto" w:fill="DDDDDD"/>
+          </w:tcPr>
+          <w:p>
+            <w:pPr>
+              <w:spacing w:before="20" w:after="20"/>
+              <w:jc w:val="center"/>
+            </w:pPr>
+            <w:r/>
+            <w:r>
+              <w:rPr>
+                <w:b/>
+                <w:sz w:val="16"/>
+              </w:rPr>
+              <w:t>KT JIA</w:t>
+            </w:r>
+          </w:p>
+        </w:tc>
+        <w:tc>
+          <w:tcPr>
+            <w:tcW w:type="dxa" w:w="2041"/>
+            <w:tcBorders>
+              <w:top w:val="single" w:sz="12" w:color="000000"/>
+              <w:left w:val="single" w:sz="12" w:color="000000"/>
+              <w:bottom w:val="single" w:sz="12" w:color="000000"/>
+              <w:right w:val="single" w:sz="12" w:color="000000"/>
+            </w:tcBorders>
+            <w:shd w:val="clear" w:color="auto" w:fill="DDDDDD"/>
+          </w:tcPr>
+          <w:p>
+            <w:pPr>
+              <w:spacing w:before="20" w:after="20"/>
+              <w:jc w:val="center"/>
+            </w:pPr>
+            <w:r/>
+            <w:r>
+              <w:rPr>
+                <w:b/>
+                <w:sz w:val="16"/>
+              </w:rPr>
+              <w:t>KT SIA</w:t>
+            </w:r>
+          </w:p>
+        </w:tc>
+        <w:tc>
+          <w:tcPr>
+            <w:tcW w:type="dxa" w:w="2041"/>
+            <w:tcBorders>
+              <w:top w:val="single" w:sz="12" w:color="000000"/>
+              <w:left w:val="single" w:sz="12" w:color="000000"/>
+              <w:bottom w:val="single" w:sz="12" w:color="000000"/>
+              <w:right w:val="single" w:sz="12" w:color="000000"/>
+            </w:tcBorders>
+            <w:shd w:val="clear" w:color="auto" w:fill="DDDDDD"/>
+          </w:tcPr>
+          <w:p>
+            <w:pPr>
+              <w:spacing w:before="20" w:after="20"/>
+              <w:jc w:val="center"/>
+            </w:pPr>
+            <w:r/>
+            <w:r>
+              <w:rPr>
+                <w:b/>
+                <w:sz w:val="16"/>
+              </w:rPr>
+              <w:t>KT ZA</w:t>
+            </w:r>
+          </w:p>
+        </w:tc>
+        <w:tc>
+          <w:tcPr>
+            <w:tcW w:type="dxa" w:w="2041"/>
+            <w:tcBorders>
+              <w:top w:val="single" w:sz="12" w:color="000000"/>
+              <w:left w:val="single" w:sz="12" w:color="000000"/>
+              <w:bottom w:val="single" w:sz="12" w:color="000000"/>
+              <w:right w:val="single" w:sz="12" w:color="000000"/>
+            </w:tcBorders>
+            <w:shd w:val="clear" w:color="auto" w:fill="DDDDDD"/>
+          </w:tcPr>
+          <w:p>
+            <w:pPr>
+              <w:spacing w:before="20" w:after="20"/>
+              <w:jc w:val="center"/>
+            </w:pPr>
+            <w:r/>
+            <w:r>
+              <w:rPr>
+                <w:b/>
+                <w:sz w:val="16"/>
+              </w:rPr>
+              <w:t>KT JA</w:t>
+            </w:r>
+          </w:p>
+        </w:tc>
+      </w:tr>
+    </w:tbl>
+    <w:p>
+      <w:pPr>
+        <w:spacing w:before="160" w:after="0"/>
+        <w:jc w:val="center"/>
+      </w:pPr>
+      <w:r>
+        <w:rPr>
+          <w:b w:val="0"/>
+          <w:sz w:val="24"/>
+        </w:rPr>
+        <w:t>Vježba orijentacije — Okić</w:t>
+      </w:r>
+    </w:p>
+    <w:p>
+      <w:pPr>
+        <w:spacing w:before="40" w:after="120"/>
+        <w:jc w:val="center"/>
+      </w:pPr>
+      <w:r>
+        <w:rPr>
+          <w:b/>
+          <w:sz w:val="30"/>
+        </w:rPr>
+        <w:t>Grupa 8</w:t>
+      </w:r>
+    </w:p>
+    <w:p>
+      <w:pPr>
+        <w:spacing w:before="0" w:after="40"/>
+        <w:jc w:val="left"/>
+      </w:pPr>
+      <w:r>
+        <w:rPr>
+          <w:b/>
+          <w:sz w:val="18"/>
+        </w:rPr>
+        <w:t>Upute:</w:t>
+      </w:r>
+    </w:p>
+    <w:p>
+      <w:pPr>
+        <w:pStyle w:val="ListBullet"/>
+        <w:spacing w:before="0" w:after="0"/>
+      </w:pPr>
+      <w:r>
+        <w:rPr>
+          <w:sz w:val="18"/>
+        </w:rPr>
+        <w:t>Staza kreće i završava na DOM-u (planinarskom domu).</w:t>
+      </w:r>
+    </w:p>
+    <w:p>
+      <w:pPr>
+        <w:pStyle w:val="ListBullet"/>
+        <w:spacing w:before="0" w:after="0"/>
+      </w:pPr>
+      <w:r>
+        <w:rPr>
+          <w:sz w:val="18"/>
+        </w:rPr>
+        <w:t>Koristeći tablicu segmenata i kompas, ucrtaj sve kontrolne točke na karti. Voditelj vježbe mora potvrditi položaj svih točaka prije polaska na teren.</w:t>
+      </w:r>
+    </w:p>
+    <w:p>
+      <w:pPr>
+        <w:pStyle w:val="ListBullet"/>
+        <w:spacing w:before="0" w:after="0"/>
+      </w:pPr>
+      <w:r>
+        <w:rPr>
+          <w:sz w:val="18"/>
+        </w:rPr>
+        <w:t>Na svakom KT-u dokaži prolazak bušenjem kartona bušačem koji se nalazi na toj točki.</w:t>
+      </w:r>
+    </w:p>
+    <w:p>
+      <w:pPr>
+        <w:pStyle w:val="ListBullet"/>
+        <w:spacing w:before="0" w:after="0"/>
+      </w:pPr>
+      <w:r>
+        <w:rPr>
+          <w:sz w:val="18"/>
+        </w:rPr>
+        <w:t>Svaki puta kada se buši karton, druga osoba iz grupe SMS-om dojavuje voditelju vježbe trenutne GPS koordinate. Koordinate su dostupne u navigacijskoj aplikaciji na mobitelu.</w:t>
+      </w:r>
+    </w:p>
+    <w:p>
+      <w:pPr>
+        <w:pStyle w:val="ListBullet"/>
+        <w:spacing w:before="0" w:after="0"/>
+      </w:pPr>
+      <w:r>
+        <w:rPr>
+          <w:sz w:val="18"/>
+        </w:rPr>
+        <w:t>Na terenu je dopušteno koristiti elektroničku navigaciju (mobitel, GPS aplikacija).</w:t>
+      </w:r>
+    </w:p>
+    <w:p>
+      <w:pPr>
+        <w:pStyle w:val="ListBullet"/>
+        <w:spacing w:before="0" w:after="0"/>
+      </w:pPr>
+      <w:r>
+        <w:rPr>
+          <w:sz w:val="18"/>
+        </w:rPr>
+        <w:t>Kretati se smije samo po označenim planinarskim stazama, cestama i šumskim putovima.</w:t>
+      </w:r>
+    </w:p>
+    <w:p>
+      <w:pPr>
+        <w:spacing w:before="160" w:after="40"/>
+        <w:jc w:val="left"/>
+      </w:pPr>
+      <w:r>
+        <w:rPr>
+          <w:b/>
+          <w:sz w:val="18"/>
+        </w:rPr>
+        <w:t>Segmenti rute:</w:t>
+      </w:r>
+    </w:p>
+    <w:tbl>
+      <w:tblPr>
+        <w:tblStyle w:val="TableGrid"/>
+        <w:tblW w:type="auto" w:w="0"/>
+        <w:jc w:val="center"/>
+        <w:tblLook w:firstColumn="1" w:firstRow="1" w:lastColumn="0" w:lastRow="0" w:noHBand="0" w:noVBand="1" w:val="04A0"/>
+      </w:tblPr>
+      <w:tblGrid>
+        <w:gridCol w:w="1701"/>
+        <w:gridCol w:w="1701"/>
+        <w:gridCol w:w="1701"/>
+        <w:gridCol w:w="1701"/>
+        <w:gridCol w:w="1701"/>
+        <w:gridCol w:w="1701"/>
+      </w:tblGrid>
+      <w:tr>
+        <w:tc>
+          <w:tcPr>
+            <w:tcW w:type="dxa" w:w="397"/>
+            <w:shd w:val="clear" w:color="auto" w:fill="BBBBBB"/>
+          </w:tcPr>
+          <w:p>
+            <w:pPr>
+              <w:spacing w:before="20" w:after="20"/>
+              <w:jc w:val="center"/>
+            </w:pPr>
+            <w:r/>
+            <w:r>
+              <w:rPr>
+                <w:b/>
+                <w:sz w:val="18"/>
+              </w:rPr>
+              <w:t>#</w:t>
+            </w:r>
+          </w:p>
+        </w:tc>
+        <w:tc>
+          <w:tcPr>
+            <w:tcW w:type="dxa" w:w="1587"/>
+            <w:shd w:val="clear" w:color="auto" w:fill="BBBBBB"/>
+          </w:tcPr>
+          <w:p>
+            <w:pPr>
+              <w:spacing w:before="20" w:after="20"/>
+              <w:jc w:val="center"/>
+            </w:pPr>
+            <w:r/>
+            <w:r>
+              <w:rPr>
+                <w:b/>
+                <w:sz w:val="18"/>
+              </w:rPr>
+              <w:t>Od</w:t>
+            </w:r>
+          </w:p>
+        </w:tc>
+        <w:tc>
+          <w:tcPr>
+            <w:tcW w:type="dxa" w:w="907"/>
+            <w:shd w:val="clear" w:color="auto" w:fill="BBBBBB"/>
+          </w:tcPr>
+          <w:p>
+            <w:pPr>
+              <w:spacing w:before="20" w:after="20"/>
+              <w:jc w:val="center"/>
+            </w:pPr>
+            <w:r/>
+            <w:r>
+              <w:rPr>
+                <w:b/>
+                <w:sz w:val="18"/>
+              </w:rPr>
+              <w:t>Azimut</w:t>
+            </w:r>
+          </w:p>
+        </w:tc>
+        <w:tc>
+          <w:tcPr>
+            <w:tcW w:type="dxa" w:w="1247"/>
+            <w:shd w:val="clear" w:color="auto" w:fill="BBBBBB"/>
+          </w:tcPr>
+          <w:p>
+            <w:pPr>
+              <w:spacing w:before="20" w:after="20"/>
+              <w:jc w:val="center"/>
+            </w:pPr>
+            <w:r/>
+            <w:r>
+              <w:rPr>
+                <w:b/>
+                <w:sz w:val="18"/>
+              </w:rPr>
+              <w:t>Udaljenost</w:t>
+            </w:r>
+          </w:p>
+        </w:tc>
+        <w:tc>
+          <w:tcPr>
+            <w:tcW w:type="dxa" w:w="1587"/>
+            <w:shd w:val="clear" w:color="auto" w:fill="BBBBBB"/>
+          </w:tcPr>
+          <w:p>
+            <w:pPr>
+              <w:spacing w:before="20" w:after="20"/>
+              <w:jc w:val="center"/>
+            </w:pPr>
+            <w:r/>
+            <w:r>
+              <w:rPr>
+                <w:b/>
+                <w:sz w:val="18"/>
+              </w:rPr>
+              <w:t>Do</w:t>
+            </w:r>
+          </w:p>
+        </w:tc>
+        <w:tc>
+          <w:tcPr>
+            <w:tcW w:type="dxa" w:w="4480"/>
+            <w:shd w:val="clear" w:color="auto" w:fill="BBBBBB"/>
+          </w:tcPr>
+          <w:p>
+            <w:pPr>
+              <w:spacing w:before="20" w:after="20"/>
+              <w:jc w:val="center"/>
+            </w:pPr>
+            <w:r/>
+            <w:r>
+              <w:rPr>
+                <w:b/>
+                <w:sz w:val="18"/>
+              </w:rPr>
+              <w:t>Opis odredišne KT</w:t>
+            </w:r>
+          </w:p>
+        </w:tc>
+      </w:tr>
+      <w:tr>
+        <w:tc>
+          <w:tcPr>
+            <w:tcW w:type="dxa" w:w="397"/>
+          </w:tcPr>
+          <w:p>
+            <w:pPr>
+              <w:spacing w:before="20" w:after="20"/>
+              <w:jc w:val="center"/>
+            </w:pPr>
+            <w:r/>
+            <w:r>
+              <w:rPr>
+                <w:b w:val="0"/>
+                <w:sz w:val="18"/>
+              </w:rPr>
+              <w:t>1</w:t>
+            </w:r>
+          </w:p>
+        </w:tc>
+        <w:tc>
+          <w:tcPr>
+            <w:tcW w:type="dxa" w:w="1587"/>
+          </w:tcPr>
+          <w:p>
+            <w:pPr>
+              <w:spacing w:before="20" w:after="20"/>
+              <w:jc w:val="left"/>
+            </w:pPr>
+            <w:r/>
+            <w:r>
+              <w:rPr>
+                <w:b w:val="0"/>
+                <w:sz w:val="18"/>
+              </w:rPr>
+              <w:t>DOM</w:t>
+            </w:r>
+          </w:p>
+        </w:tc>
+        <w:tc>
+          <w:tcPr>
+            <w:tcW w:type="dxa" w:w="907"/>
+          </w:tcPr>
+          <w:p>
+            <w:pPr>
+              <w:spacing w:before="20" w:after="20"/>
+              <w:jc w:val="center"/>
+            </w:pPr>
+            <w:r/>
+            <w:r>
+              <w:rPr>
+                <w:b w:val="0"/>
+                <w:sz w:val="18"/>
+              </w:rPr>
+              <w:t>358°</w:t>
+            </w:r>
+          </w:p>
+        </w:tc>
+        <w:tc>
+          <w:tcPr>
+            <w:tcW w:type="dxa" w:w="1247"/>
+          </w:tcPr>
+          <w:p>
+            <w:pPr>
+              <w:spacing w:before="20" w:after="20"/>
+              <w:jc w:val="center"/>
+            </w:pPr>
+            <w:r/>
+            <w:r>
+              <w:rPr>
+                <w:b w:val="0"/>
+                <w:sz w:val="18"/>
+              </w:rPr>
+              <w:t>500 m</w:t>
+            </w:r>
+          </w:p>
+        </w:tc>
+        <w:tc>
+          <w:tcPr>
+            <w:tcW w:type="dxa" w:w="1587"/>
+          </w:tcPr>
+          <w:p>
+            <w:pPr>
+              <w:spacing w:before="20" w:after="20"/>
+              <w:jc w:val="left"/>
+            </w:pPr>
+            <w:r/>
+            <w:r>
+              <w:rPr>
+                <w:b w:val="0"/>
+                <w:sz w:val="18"/>
+              </w:rPr>
+              <w:t>KT JIA</w:t>
+            </w:r>
+          </w:p>
+        </w:tc>
+        <w:tc>
+          <w:tcPr>
+            <w:tcW w:type="dxa" w:w="4480"/>
+          </w:tcPr>
+          <w:p>
+            <w:pPr>
+              <w:spacing w:before="20" w:after="20"/>
+              <w:jc w:val="left"/>
+            </w:pPr>
+            <w:r/>
+            <w:r>
+              <w:rPr>
+                <w:b w:val="0"/>
+                <w:sz w:val="18"/>
+              </w:rPr>
+              <w:t>Prelazak ceste preko potoka</w:t>
+            </w:r>
+          </w:p>
+        </w:tc>
+      </w:tr>
+      <w:tr>
+        <w:tc>
+          <w:tcPr>
+            <w:tcW w:type="dxa" w:w="397"/>
+          </w:tcPr>
+          <w:p>
+            <w:pPr>
+              <w:spacing w:before="20" w:after="20"/>
+              <w:jc w:val="center"/>
+            </w:pPr>
+            <w:r/>
+            <w:r>
+              <w:rPr>
+                <w:b w:val="0"/>
+                <w:sz w:val="18"/>
+              </w:rPr>
+              <w:t>2</w:t>
+            </w:r>
+          </w:p>
+        </w:tc>
+        <w:tc>
+          <w:tcPr>
+            <w:tcW w:type="dxa" w:w="1587"/>
+          </w:tcPr>
+          <w:p>
+            <w:pPr>
+              <w:spacing w:before="20" w:after="20"/>
+              <w:jc w:val="left"/>
+            </w:pPr>
+            <w:r/>
+            <w:r>
+              <w:rPr>
+                <w:b w:val="0"/>
+                <w:sz w:val="18"/>
+              </w:rPr>
+              <w:t>KT JIA</w:t>
+            </w:r>
+          </w:p>
+        </w:tc>
+        <w:tc>
+          <w:tcPr>
+            <w:tcW w:type="dxa" w:w="907"/>
+          </w:tcPr>
+          <w:p>
+            <w:pPr>
+              <w:spacing w:before="20" w:after="20"/>
+              <w:jc w:val="center"/>
+            </w:pPr>
+            <w:r/>
+            <w:r>
+              <w:rPr>
+                <w:b w:val="0"/>
+                <w:sz w:val="18"/>
+              </w:rPr>
+              <w:t>350°</w:t>
+            </w:r>
+          </w:p>
+        </w:tc>
+        <w:tc>
+          <w:tcPr>
+            <w:tcW w:type="dxa" w:w="1247"/>
+          </w:tcPr>
+          <w:p>
+            <w:pPr>
+              <w:spacing w:before="20" w:after="20"/>
+              <w:jc w:val="center"/>
+            </w:pPr>
+            <w:r/>
+            <w:r>
+              <w:rPr>
+                <w:b w:val="0"/>
+                <w:sz w:val="18"/>
+              </w:rPr>
+              <w:t>487 m</w:t>
+            </w:r>
+          </w:p>
+        </w:tc>
+        <w:tc>
+          <w:tcPr>
+            <w:tcW w:type="dxa" w:w="1587"/>
+          </w:tcPr>
+          <w:p>
+            <w:pPr>
+              <w:spacing w:before="20" w:after="20"/>
+              <w:jc w:val="left"/>
+            </w:pPr>
+            <w:r/>
+            <w:r>
+              <w:rPr>
+                <w:b w:val="0"/>
+                <w:sz w:val="18"/>
+              </w:rPr>
+              <w:t>KT SIA</w:t>
+            </w:r>
+          </w:p>
+        </w:tc>
+        <w:tc>
+          <w:tcPr>
+            <w:tcW w:type="dxa" w:w="4480"/>
+          </w:tcPr>
+          <w:p>
+            <w:pPr>
+              <w:spacing w:before="20" w:after="20"/>
+              <w:jc w:val="left"/>
+            </w:pPr>
+            <w:r/>
+            <w:r>
+              <w:rPr>
+                <w:b w:val="0"/>
+                <w:sz w:val="18"/>
+              </w:rPr>
+              <w:t>Raskrižje ceste i puta</w:t>
+            </w:r>
+          </w:p>
+        </w:tc>
+      </w:tr>
+      <w:tr>
+        <w:tc>
+          <w:tcPr>
+            <w:tcW w:type="dxa" w:w="397"/>
+          </w:tcPr>
+          <w:p>
+            <w:pPr>
+              <w:spacing w:before="20" w:after="20"/>
+              <w:jc w:val="center"/>
+            </w:pPr>
+            <w:r/>
+            <w:r>
+              <w:rPr>
+                <w:b w:val="0"/>
+                <w:sz w:val="18"/>
+              </w:rPr>
+              <w:t>3</w:t>
+            </w:r>
+          </w:p>
+        </w:tc>
+        <w:tc>
+          <w:tcPr>
+            <w:tcW w:type="dxa" w:w="1587"/>
+          </w:tcPr>
+          <w:p>
+            <w:pPr>
+              <w:spacing w:before="20" w:after="20"/>
+              <w:jc w:val="left"/>
+            </w:pPr>
+            <w:r/>
+            <w:r>
+              <w:rPr>
+                <w:b w:val="0"/>
+                <w:sz w:val="18"/>
+              </w:rPr>
+              <w:t>KT SIA</w:t>
+            </w:r>
+          </w:p>
+        </w:tc>
+        <w:tc>
+          <w:tcPr>
+            <w:tcW w:type="dxa" w:w="907"/>
+          </w:tcPr>
+          <w:p>
+            <w:pPr>
+              <w:spacing w:before="20" w:after="20"/>
+              <w:jc w:val="center"/>
+            </w:pPr>
+            <w:r/>
+            <w:r>
+              <w:rPr>
+                <w:b w:val="0"/>
+                <w:sz w:val="18"/>
+              </w:rPr>
+              <w:t>238°</w:t>
+            </w:r>
+          </w:p>
+        </w:tc>
+        <w:tc>
+          <w:tcPr>
+            <w:tcW w:type="dxa" w:w="1247"/>
+          </w:tcPr>
+          <w:p>
+            <w:pPr>
+              <w:spacing w:before="20" w:after="20"/>
+              <w:jc w:val="center"/>
+            </w:pPr>
+            <w:r/>
+            <w:r>
+              <w:rPr>
+                <w:b w:val="0"/>
+                <w:sz w:val="18"/>
+              </w:rPr>
+              <w:t>874 m</w:t>
+            </w:r>
+          </w:p>
+        </w:tc>
+        <w:tc>
+          <w:tcPr>
+            <w:tcW w:type="dxa" w:w="1587"/>
+          </w:tcPr>
+          <w:p>
+            <w:pPr>
+              <w:spacing w:before="20" w:after="20"/>
+              <w:jc w:val="left"/>
+            </w:pPr>
+            <w:r/>
+            <w:r>
+              <w:rPr>
+                <w:b w:val="0"/>
+                <w:sz w:val="18"/>
+              </w:rPr>
+              <w:t>KT ZA</w:t>
+            </w:r>
+          </w:p>
+        </w:tc>
+        <w:tc>
+          <w:tcPr>
+            <w:tcW w:type="dxa" w:w="4480"/>
+          </w:tcPr>
+          <w:p>
+            <w:pPr>
+              <w:spacing w:before="20" w:after="20"/>
+              <w:jc w:val="left"/>
+            </w:pPr>
+            <w:r/>
+            <w:r>
+              <w:rPr>
+                <w:b w:val="0"/>
+                <w:sz w:val="18"/>
+              </w:rPr>
+              <w:t>Raskrižje puta i ceste</w:t>
+            </w:r>
+          </w:p>
+        </w:tc>
+      </w:tr>
+      <w:tr>
+        <w:tc>
+          <w:tcPr>
+            <w:tcW w:type="dxa" w:w="397"/>
+          </w:tcPr>
+          <w:p>
+            <w:pPr>
+              <w:spacing w:before="20" w:after="20"/>
+              <w:jc w:val="center"/>
+            </w:pPr>
+            <w:r/>
+            <w:r>
+              <w:rPr>
+                <w:b w:val="0"/>
+                <w:sz w:val="18"/>
+              </w:rPr>
+              <w:t>4</w:t>
+            </w:r>
+          </w:p>
+        </w:tc>
+        <w:tc>
+          <w:tcPr>
+            <w:tcW w:type="dxa" w:w="1587"/>
+          </w:tcPr>
+          <w:p>
+            <w:pPr>
+              <w:spacing w:before="20" w:after="20"/>
+              <w:jc w:val="left"/>
+            </w:pPr>
+            <w:r/>
+            <w:r>
+              <w:rPr>
+                <w:b w:val="0"/>
+                <w:sz w:val="18"/>
+              </w:rPr>
+              <w:t>KT ZA</w:t>
+            </w:r>
+          </w:p>
+        </w:tc>
+        <w:tc>
+          <w:tcPr>
+            <w:tcW w:type="dxa" w:w="907"/>
+          </w:tcPr>
+          <w:p>
+            <w:pPr>
+              <w:spacing w:before="20" w:after="20"/>
+              <w:jc w:val="center"/>
+            </w:pPr>
+            <w:r/>
+            <w:r>
+              <w:rPr>
+                <w:b w:val="0"/>
+                <w:sz w:val="18"/>
+              </w:rPr>
+              <w:t>119°</w:t>
+            </w:r>
+          </w:p>
+        </w:tc>
+        <w:tc>
+          <w:tcPr>
+            <w:tcW w:type="dxa" w:w="1247"/>
+          </w:tcPr>
+          <w:p>
+            <w:pPr>
+              <w:spacing w:before="20" w:after="20"/>
+              <w:jc w:val="center"/>
+            </w:pPr>
+            <w:r/>
+            <w:r>
+              <w:rPr>
+                <w:b w:val="0"/>
+                <w:sz w:val="18"/>
+              </w:rPr>
+              <w:t>755 m</w:t>
+            </w:r>
+          </w:p>
+        </w:tc>
+        <w:tc>
+          <w:tcPr>
+            <w:tcW w:type="dxa" w:w="1587"/>
+          </w:tcPr>
+          <w:p>
+            <w:pPr>
+              <w:spacing w:before="20" w:after="20"/>
+              <w:jc w:val="left"/>
+            </w:pPr>
+            <w:r/>
+            <w:r>
+              <w:rPr>
+                <w:b w:val="0"/>
+                <w:sz w:val="18"/>
+              </w:rPr>
+              <w:t>KT JA</w:t>
+            </w:r>
+          </w:p>
+        </w:tc>
+        <w:tc>
+          <w:tcPr>
+            <w:tcW w:type="dxa" w:w="4480"/>
+          </w:tcPr>
+          <w:p>
+            <w:pPr>
+              <w:spacing w:before="20" w:after="20"/>
+              <w:jc w:val="left"/>
+            </w:pPr>
+            <w:r/>
+            <w:r>
+              <w:rPr>
+                <w:b w:val="0"/>
+                <w:sz w:val="18"/>
+              </w:rPr>
+              <w:t>Raskrižje ceste i planinske staze</w:t>
+            </w:r>
+          </w:p>
+        </w:tc>
+      </w:tr>
+      <w:tr>
+        <w:tc>
+          <w:tcPr>
+            <w:tcW w:type="dxa" w:w="397"/>
+          </w:tcPr>
+          <w:p>
+            <w:pPr>
+              <w:spacing w:before="20" w:after="20"/>
+              <w:jc w:val="center"/>
+            </w:pPr>
+            <w:r/>
+            <w:r>
+              <w:rPr>
+                <w:b w:val="0"/>
+                <w:sz w:val="18"/>
+              </w:rPr>
+              <w:t>5</w:t>
+            </w:r>
+          </w:p>
+        </w:tc>
+        <w:tc>
+          <w:tcPr>
+            <w:tcW w:type="dxa" w:w="1587"/>
+          </w:tcPr>
+          <w:p>
+            <w:pPr>
+              <w:spacing w:before="20" w:after="20"/>
+              <w:jc w:val="left"/>
+            </w:pPr>
+            <w:r/>
+            <w:r>
+              <w:rPr>
+                <w:b w:val="0"/>
+                <w:sz w:val="18"/>
+              </w:rPr>
+              <w:t>KT JA</w:t>
+            </w:r>
+          </w:p>
+        </w:tc>
+        <w:tc>
+          <w:tcPr>
+            <w:tcW w:type="dxa" w:w="907"/>
+          </w:tcPr>
+          <w:p>
+            <w:pPr>
+              <w:spacing w:before="20" w:after="20"/>
+              <w:jc w:val="center"/>
+            </w:pPr>
+            <w:r/>
+            <w:r>
+              <w:rPr>
+                <w:b w:val="0"/>
+                <w:sz w:val="18"/>
+              </w:rPr>
+              <w:t>128°</w:t>
+            </w:r>
+          </w:p>
+        </w:tc>
+        <w:tc>
+          <w:tcPr>
+            <w:tcW w:type="dxa" w:w="1247"/>
+          </w:tcPr>
+          <w:p>
+            <w:pPr>
+              <w:spacing w:before="20" w:after="20"/>
+              <w:jc w:val="center"/>
+            </w:pPr>
+            <w:r/>
+            <w:r>
+              <w:rPr>
+                <w:b w:val="0"/>
+                <w:sz w:val="18"/>
+              </w:rPr>
+              <w:t>236 m</w:t>
             </w:r>
           </w:p>
         </w:tc>

</xml_diff>